<commit_message>
Update manuscripts, population labels, analyses, and figures
</commit_message>
<xml_diff>
--- a/manuscript/Physaria_globosa_final_biorxiv.docx
+++ b/manuscript/Physaria_globosa_final_biorxiv.docx
@@ -1,6 +1,6 @@
 
 <file path=word/document.xml><?xml version="1.0" encoding="utf-8"?>
-<w:document xmlns:wpc="http://schemas.microsoft.com/office/word/2010/wordprocessingCanvas" xmlns:cx="http://schemas.microsoft.com/office/drawing/2014/chartex" xmlns:cx1="http://schemas.microsoft.com/office/drawing/2015/9/8/chartex" xmlns:cx2="http://schemas.microsoft.com/office/drawing/2015/10/21/chartex" xmlns:cx3="http://schemas.microsoft.com/office/drawing/2016/5/9/chartex" xmlns:cx4="http://schemas.microsoft.com/office/drawing/2016/5/10/chartex" xmlns:cx5="http://schemas.microsoft.com/office/drawing/2016/5/11/chartex" xmlns:cx6="http://schemas.microsoft.com/office/drawing/2016/5/12/chartex" xmlns:cx7="http://schemas.microsoft.com/office/drawing/2016/5/13/chartex" xmlns:cx8="http://schemas.microsoft.com/office/drawing/2016/5/14/chartex" xmlns:mc="http://schemas.openxmlformats.org/markup-compatibility/2006" xmlns:aink="http://schemas.microsoft.com/office/drawing/2016/ink" xmlns:am3d="http://schemas.microsoft.com/office/drawing/2017/model3d" xmlns:o="urn:schemas-microsoft-com:office:office" xmlns:oel="http://schemas.microsoft.com/office/2019/extlst" xmlns:r="http://schemas.openxmlformats.org/officeDocument/2006/relationships" xmlns:m="http://schemas.openxmlformats.org/officeDocument/2006/math" xmlns:v="urn:schemas-microsoft-com:vml" xmlns:wp14="http://schemas.microsoft.com/office/word/2010/wordprocessingDrawing" xmlns:wp="http://schemas.openxmlformats.org/drawingml/2006/wordprocessingDrawing" xmlns:w10="urn:schemas-microsoft-com:office:word" xmlns:w="http://schemas.openxmlformats.org/wordprocessingml/2006/main" xmlns:w14="http://schemas.microsoft.com/office/word/2010/wordml" xmlns:w15="http://schemas.microsoft.com/office/word/2012/wordml" xmlns:w16cex="http://schemas.microsoft.com/office/word/2018/wordml/cex" xmlns:w16cid="http://schemas.microsoft.com/office/word/2016/wordml/cid" xmlns:w16="http://schemas.microsoft.com/office/word/2018/wordml" xmlns:w16du="http://schemas.microsoft.com/office/word/2023/wordml/word16du" xmlns:w16sdtdh="http://schemas.microsoft.com/office/word/2020/wordml/sdtdatahash" xmlns:w16sdtfl="http://schemas.microsoft.com/office/word/2024/wordml/sdtformatlock" xmlns:w16se="http://schemas.microsoft.com/office/word/2015/wordml/symex" xmlns:wpg="http://schemas.microsoft.com/office/word/2010/wordprocessingGroup" xmlns:wpi="http://schemas.microsoft.com/office/word/2010/wordprocessingInk" xmlns:wne="http://schemas.microsoft.com/office/word/2006/wordml" xmlns:wps="http://schemas.microsoft.com/office/word/2010/wordprocessingShape" mc:Ignorable="w14 w15 w16se w16cid w16 w16cex w16sdtdh w16sdtfl w16du wp14">
+<w:document xmlns:wpc="http://schemas.microsoft.com/office/word/2010/wordprocessingCanvas" xmlns:cx="http://schemas.microsoft.com/office/drawing/2014/chartex" xmlns:cx1="http://schemas.microsoft.com/office/drawing/2015/9/8/chartex" xmlns:cx2="http://schemas.microsoft.com/office/drawing/2015/10/21/chartex" xmlns:cx3="http://schemas.microsoft.com/office/drawing/2016/5/9/chartex" xmlns:cx4="http://schemas.microsoft.com/office/drawing/2016/5/10/chartex" xmlns:cx5="http://schemas.microsoft.com/office/drawing/2016/5/11/chartex" xmlns:cx6="http://schemas.microsoft.com/office/drawing/2016/5/12/chartex" xmlns:cx7="http://schemas.microsoft.com/office/drawing/2016/5/13/chartex" xmlns:cx8="http://schemas.microsoft.com/office/drawing/2016/5/14/chartex" xmlns:mc="http://schemas.openxmlformats.org/markup-compatibility/2006" xmlns:m="http://schemas.openxmlformats.org/officeDocument/2006/math" xmlns:aink="http://schemas.microsoft.com/office/drawing/2016/ink" xmlns:am3d="http://schemas.microsoft.com/office/drawing/2017/model3d" xmlns:oel="http://schemas.microsoft.com/office/2019/extlst" xmlns:r="http://schemas.openxmlformats.org/officeDocument/2006/relationships" xmlns:wp14="http://schemas.microsoft.com/office/word/2010/wordprocessingDrawing" xmlns:wp="http://schemas.openxmlformats.org/drawingml/2006/wordprocessingDrawing" xmlns:wpg="http://schemas.microsoft.com/office/word/2010/wordprocessingGroup" xmlns:wpi="http://schemas.microsoft.com/office/word/2010/wordprocessingInk" xmlns:wps="http://schemas.microsoft.com/office/word/2010/wordprocessingShape" xmlns:o="urn:schemas-microsoft-com:office:office" xmlns:v="urn:schemas-microsoft-com:vml" xmlns:w10="urn:schemas-microsoft-com:office:word" xmlns:w="http://schemas.openxmlformats.org/wordprocessingml/2006/main" xmlns:w14="http://schemas.microsoft.com/office/word/2010/wordml" xmlns:w15="http://schemas.microsoft.com/office/word/2012/wordml" xmlns:w16cex="http://schemas.microsoft.com/office/word/2018/wordml/cex" xmlns:w16cid="http://schemas.microsoft.com/office/word/2016/wordml/cid" xmlns:w16="http://schemas.microsoft.com/office/word/2018/wordml" xmlns:w16sdtdh="http://schemas.microsoft.com/office/word/2020/wordml/sdtdatahash" xmlns:w16sdtfl="http://schemas.microsoft.com/office/word/2024/wordml/sdtformatlock" xmlns:w16se="http://schemas.microsoft.com/office/word/2015/wordml/symex" xmlns:w16du="http://schemas.microsoft.com/office/word/2023/wordml/word16du" xmlns:wne="http://schemas.microsoft.com/office/word/2006/wordml" mc:Ignorable="w14 w15 w16se w16cid w16 w16cex w16sdtdh w16sdtfl w16du wp14">
   <w:body>
     <w:p>
       <w:pPr>
@@ -4896,15 +4896,7 @@
         <w:spacing w:line="480" w:lineRule="auto"/>
       </w:pPr>
       <w:r>
-        <w:t xml:space="preserve">The MiSeq run of the two samples resulted in 1,049,048 and 1,163,933 </w:t>
-      </w:r>
-      <w:proofErr w:type="gramStart"/>
-      <w:r>
-        <w:t>paired-end</w:t>
-      </w:r>
-      <w:proofErr w:type="gramEnd"/>
-      <w:r>
-        <w:t xml:space="preserve"> reads. The reads of the two individuals were assembled </w:t>
+        <w:t xml:space="preserve">The MiSeq run of the two samples resulted in 1,049,048 and 1,163,933 paired-end reads. The reads of the two individuals were assembled </w:t>
       </w:r>
       <w:r>
         <w:rPr>
@@ -19978,6 +19970,7 @@
       <w:pPr>
         <w:pStyle w:val="tablelegend"/>
         <w:spacing w:before="0" w:line="240" w:lineRule="auto"/>
+        <w:ind w:firstLine="0"/>
         <w:rPr>
           <w:sz w:val="24"/>
           <w:szCs w:val="24"/>
@@ -32572,7 +32565,8 @@
     </w:p>
     <w:tbl>
       <w:tblPr>
-        <w:tblW w:w="8272" w:type="dxa"/>
+        <w:tblW w:w="9775" w:type="dxa"/>
+        <w:tblLayout w:type="fixed"/>
         <w:tblCellMar>
           <w:left w:w="0" w:type="dxa"/>
           <w:right w:w="0" w:type="dxa"/>
@@ -32580,12 +32574,12 @@
         <w:tblLook w:val="04A0" w:firstRow="1" w:lastRow="0" w:firstColumn="1" w:lastColumn="0" w:noHBand="0" w:noVBand="1"/>
       </w:tblPr>
       <w:tblGrid>
-        <w:gridCol w:w="1925"/>
+        <w:gridCol w:w="2340"/>
         <w:gridCol w:w="1701"/>
         <w:gridCol w:w="1489"/>
-        <w:gridCol w:w="1575"/>
-        <w:gridCol w:w="90"/>
-        <w:gridCol w:w="983"/>
+        <w:gridCol w:w="1477"/>
+        <w:gridCol w:w="127"/>
+        <w:gridCol w:w="1044"/>
         <w:gridCol w:w="1597"/>
       </w:tblGrid>
       <w:tr>
@@ -32594,7 +32588,7 @@
         </w:trPr>
         <w:tc>
           <w:tcPr>
-            <w:tcW w:w="1535" w:type="dxa"/>
+            <w:tcW w:w="2340" w:type="dxa"/>
             <w:tcBorders>
               <w:top w:val="single" w:sz="4" w:space="0" w:color="auto"/>
               <w:bottom w:val="single" w:sz="4" w:space="0" w:color="auto"/>
@@ -32608,22 +32602,32 @@
             <w:vAlign w:val="center"/>
             <w:hideMark/>
           </w:tcPr>
-          <w:p/>
-        </w:tc>
-        <w:tc>
-          <w:tcPr>
-            <w:tcW w:w="1297" w:type="dxa"/>
+          <w:p>
+            <w:pPr>
+              <w:spacing w:before="0" w:after="0"/>
+              <w:ind w:firstLine="0"/>
+            </w:pPr>
+          </w:p>
+        </w:tc>
+        <w:tc>
+          <w:tcPr>
+            <w:tcW w:w="1701" w:type="dxa"/>
             <w:tcBorders>
               <w:top w:val="single" w:sz="4" w:space="0" w:color="auto"/>
               <w:bottom w:val="single" w:sz="4" w:space="0" w:color="auto"/>
             </w:tcBorders>
             <w:vAlign w:val="center"/>
           </w:tcPr>
-          <w:p/>
-        </w:tc>
-        <w:tc>
-          <w:tcPr>
-            <w:tcW w:w="2292" w:type="dxa"/>
+          <w:p>
+            <w:pPr>
+              <w:spacing w:before="0" w:after="0"/>
+              <w:ind w:firstLine="0"/>
+            </w:pPr>
+          </w:p>
+        </w:tc>
+        <w:tc>
+          <w:tcPr>
+            <w:tcW w:w="2966" w:type="dxa"/>
             <w:gridSpan w:val="2"/>
             <w:tcBorders>
               <w:top w:val="single" w:sz="4" w:space="0" w:color="auto"/>
@@ -32640,7 +32644,8 @@
           </w:tcPr>
           <w:p>
             <w:pPr>
-              <w:jc w:val="center"/>
+              <w:spacing w:before="0" w:after="0"/>
+              <w:ind w:firstLine="0"/>
             </w:pPr>
             <w:r>
               <w:t>Excess in heterozygosity</w:t>
@@ -32649,7 +32654,7 @@
         </w:tc>
         <w:tc>
           <w:tcPr>
-            <w:tcW w:w="3148" w:type="dxa"/>
+            <w:tcW w:w="2768" w:type="dxa"/>
             <w:gridSpan w:val="3"/>
             <w:tcBorders>
               <w:top w:val="single" w:sz="4" w:space="0" w:color="auto"/>
@@ -32666,7 +32671,8 @@
           </w:tcPr>
           <w:p>
             <w:pPr>
-              <w:jc w:val="center"/>
+              <w:spacing w:before="0" w:after="0"/>
+              <w:ind w:firstLine="0"/>
             </w:pPr>
             <w:r>
               <w:t>Deficiency in M-Ratio</w:t>
@@ -32680,7 +32686,7 @@
         </w:trPr>
         <w:tc>
           <w:tcPr>
-            <w:tcW w:w="1535" w:type="dxa"/>
+            <w:tcW w:w="2340" w:type="dxa"/>
             <w:tcBorders>
               <w:top w:val="single" w:sz="4" w:space="0" w:color="auto"/>
             </w:tcBorders>
@@ -32694,6 +32700,10 @@
             <w:hideMark/>
           </w:tcPr>
           <w:p>
+            <w:pPr>
+              <w:spacing w:before="0" w:after="0"/>
+              <w:ind w:firstLine="0"/>
+            </w:pPr>
             <w:r>
               <w:t>Population</w:t>
             </w:r>
@@ -32701,13 +32711,17 @@
         </w:tc>
         <w:tc>
           <w:tcPr>
-            <w:tcW w:w="1297" w:type="dxa"/>
+            <w:tcW w:w="1701" w:type="dxa"/>
             <w:tcBorders>
               <w:top w:val="single" w:sz="4" w:space="0" w:color="auto"/>
             </w:tcBorders>
             <w:vAlign w:val="center"/>
           </w:tcPr>
           <w:p>
+            <w:pPr>
+              <w:spacing w:before="0" w:after="0"/>
+              <w:ind w:firstLine="0"/>
+            </w:pPr>
             <w:r>
               <w:t>Geographic area</w:t>
             </w:r>
@@ -32715,7 +32729,7 @@
         </w:tc>
         <w:tc>
           <w:tcPr>
-            <w:tcW w:w="1111" w:type="dxa"/>
+            <w:tcW w:w="1489" w:type="dxa"/>
             <w:tcBorders>
               <w:top w:val="single" w:sz="4" w:space="0" w:color="auto"/>
             </w:tcBorders>
@@ -32729,6 +32743,10 @@
             <w:hideMark/>
           </w:tcPr>
           <w:p>
+            <w:pPr>
+              <w:spacing w:before="0" w:after="0"/>
+              <w:ind w:firstLine="0"/>
+            </w:pPr>
             <w:r>
               <w:t>Z-test</w:t>
             </w:r>
@@ -32736,7 +32754,7 @@
         </w:tc>
         <w:tc>
           <w:tcPr>
-            <w:tcW w:w="1193" w:type="dxa"/>
+            <w:tcW w:w="1604" w:type="dxa"/>
             <w:gridSpan w:val="2"/>
             <w:tcBorders>
               <w:top w:val="single" w:sz="4" w:space="0" w:color="auto"/>
@@ -32751,6 +32769,10 @@
             <w:hideMark/>
           </w:tcPr>
           <w:p>
+            <w:pPr>
+              <w:spacing w:before="0" w:after="0"/>
+              <w:ind w:firstLine="0"/>
+            </w:pPr>
             <w:r>
               <w:t>Wilcoxon signed-rank test</w:t>
             </w:r>
@@ -32758,7 +32780,7 @@
         </w:tc>
         <w:tc>
           <w:tcPr>
-            <w:tcW w:w="1516" w:type="dxa"/>
+            <w:tcW w:w="1044" w:type="dxa"/>
             <w:tcBorders>
               <w:top w:val="single" w:sz="4" w:space="0" w:color="auto"/>
             </w:tcBorders>
@@ -32772,6 +32794,10 @@
             <w:hideMark/>
           </w:tcPr>
           <w:p>
+            <w:pPr>
+              <w:spacing w:before="0" w:after="0"/>
+              <w:ind w:firstLine="0"/>
+            </w:pPr>
             <w:r>
               <w:t>Z-test</w:t>
             </w:r>
@@ -32779,7 +32805,7 @@
         </w:tc>
         <w:tc>
           <w:tcPr>
-            <w:tcW w:w="1620" w:type="dxa"/>
+            <w:tcW w:w="1597" w:type="dxa"/>
             <w:tcBorders>
               <w:top w:val="single" w:sz="4" w:space="0" w:color="auto"/>
             </w:tcBorders>
@@ -32793,6 +32819,10 @@
             <w:hideMark/>
           </w:tcPr>
           <w:p>
+            <w:pPr>
+              <w:spacing w:before="0" w:after="0"/>
+              <w:ind w:firstLine="0"/>
+            </w:pPr>
             <w:r>
               <w:t>Wilcoxon signed-rank test</w:t>
             </w:r>
@@ -32805,7 +32835,7 @@
         </w:trPr>
         <w:tc>
           <w:tcPr>
-            <w:tcW w:w="1535" w:type="dxa"/>
+            <w:tcW w:w="2340" w:type="dxa"/>
             <w:tcMar>
               <w:top w:w="30" w:type="dxa"/>
               <w:left w:w="45" w:type="dxa"/>
@@ -32816,6 +32846,10 @@
             <w:hideMark/>
           </w:tcPr>
           <w:p>
+            <w:pPr>
+              <w:spacing w:before="0" w:after="0"/>
+              <w:ind w:firstLine="0"/>
+            </w:pPr>
             <w:r>
               <w:t>Pgl346_IN</w:t>
             </w:r>
@@ -32823,10 +32857,14 @@
         </w:tc>
         <w:tc>
           <w:tcPr>
-            <w:tcW w:w="1297" w:type="dxa"/>
-            <w:vAlign w:val="center"/>
-          </w:tcPr>
-          <w:p>
+            <w:tcW w:w="1701" w:type="dxa"/>
+            <w:vAlign w:val="center"/>
+          </w:tcPr>
+          <w:p>
+            <w:pPr>
+              <w:spacing w:before="0" w:after="0"/>
+              <w:ind w:firstLine="0"/>
+            </w:pPr>
             <w:r>
               <w:rPr>
                 <w:color w:val="000000"/>
@@ -32837,7 +32875,7 @@
         </w:tc>
         <w:tc>
           <w:tcPr>
-            <w:tcW w:w="1111" w:type="dxa"/>
+            <w:tcW w:w="1489" w:type="dxa"/>
             <w:tcMar>
               <w:top w:w="30" w:type="dxa"/>
               <w:left w:w="45" w:type="dxa"/>
@@ -32848,6 +32886,10 @@
             <w:hideMark/>
           </w:tcPr>
           <w:p>
+            <w:pPr>
+              <w:spacing w:before="0" w:after="0"/>
+              <w:ind w:firstLine="0"/>
+            </w:pPr>
             <w:r>
               <w:t>0.1445</w:t>
             </w:r>
@@ -32855,7 +32897,7 @@
         </w:tc>
         <w:tc>
           <w:tcPr>
-            <w:tcW w:w="1193" w:type="dxa"/>
+            <w:tcW w:w="1604" w:type="dxa"/>
             <w:gridSpan w:val="2"/>
             <w:tcMar>
               <w:top w:w="30" w:type="dxa"/>
@@ -32867,6 +32909,10 @@
             <w:hideMark/>
           </w:tcPr>
           <w:p>
+            <w:pPr>
+              <w:spacing w:before="0" w:after="0"/>
+              <w:ind w:firstLine="0"/>
+            </w:pPr>
             <w:r>
               <w:t>0.213</w:t>
             </w:r>
@@ -32874,7 +32920,7 @@
         </w:tc>
         <w:tc>
           <w:tcPr>
-            <w:tcW w:w="1516" w:type="dxa"/>
+            <w:tcW w:w="1044" w:type="dxa"/>
             <w:tcMar>
               <w:top w:w="30" w:type="dxa"/>
               <w:left w:w="45" w:type="dxa"/>
@@ -32886,6 +32932,8 @@
           </w:tcPr>
           <w:p>
             <w:pPr>
+              <w:spacing w:before="0" w:after="0"/>
+              <w:ind w:firstLine="0"/>
               <w:rPr>
                 <w:b/>
                 <w:bCs/>
@@ -32902,7 +32950,7 @@
         </w:tc>
         <w:tc>
           <w:tcPr>
-            <w:tcW w:w="1620" w:type="dxa"/>
+            <w:tcW w:w="1597" w:type="dxa"/>
             <w:tcMar>
               <w:top w:w="30" w:type="dxa"/>
               <w:left w:w="45" w:type="dxa"/>
@@ -32914,6 +32962,8 @@
           </w:tcPr>
           <w:p>
             <w:pPr>
+              <w:spacing w:before="0" w:after="0"/>
+              <w:ind w:firstLine="0"/>
               <w:rPr>
                 <w:b/>
                 <w:bCs/>
@@ -32935,7 +32985,7 @@
         </w:trPr>
         <w:tc>
           <w:tcPr>
-            <w:tcW w:w="1535" w:type="dxa"/>
+            <w:tcW w:w="2340" w:type="dxa"/>
             <w:tcMar>
               <w:top w:w="30" w:type="dxa"/>
               <w:left w:w="45" w:type="dxa"/>
@@ -32947,6 +32997,8 @@
           </w:tcPr>
           <w:p>
             <w:pPr>
+              <w:spacing w:before="0" w:after="0"/>
+              <w:ind w:firstLine="0"/>
               <w:rPr>
                 <w:b/>
                 <w:bCs/>
@@ -32959,10 +33011,14 @@
         </w:tc>
         <w:tc>
           <w:tcPr>
-            <w:tcW w:w="1297" w:type="dxa"/>
-            <w:vAlign w:val="center"/>
-          </w:tcPr>
-          <w:p>
+            <w:tcW w:w="1701" w:type="dxa"/>
+            <w:vAlign w:val="center"/>
+          </w:tcPr>
+          <w:p>
+            <w:pPr>
+              <w:spacing w:before="0" w:after="0"/>
+              <w:ind w:firstLine="0"/>
+            </w:pPr>
             <w:r>
               <w:rPr>
                 <w:color w:val="000000"/>
@@ -32973,7 +33029,7 @@
         </w:tc>
         <w:tc>
           <w:tcPr>
-            <w:tcW w:w="1111" w:type="dxa"/>
+            <w:tcW w:w="1489" w:type="dxa"/>
             <w:tcMar>
               <w:top w:w="30" w:type="dxa"/>
               <w:left w:w="45" w:type="dxa"/>
@@ -32984,6 +33040,10 @@
             <w:hideMark/>
           </w:tcPr>
           <w:p>
+            <w:pPr>
+              <w:spacing w:before="0" w:after="0"/>
+              <w:ind w:firstLine="0"/>
+            </w:pPr>
             <w:r>
               <w:t>1.4579</w:t>
             </w:r>
@@ -32991,7 +33051,7 @@
         </w:tc>
         <w:tc>
           <w:tcPr>
-            <w:tcW w:w="1193" w:type="dxa"/>
+            <w:tcW w:w="1604" w:type="dxa"/>
             <w:gridSpan w:val="2"/>
             <w:tcMar>
               <w:top w:w="30" w:type="dxa"/>
@@ -33004,6 +33064,8 @@
           </w:tcPr>
           <w:p>
             <w:pPr>
+              <w:spacing w:before="0" w:after="0"/>
+              <w:ind w:firstLine="0"/>
               <w:rPr>
                 <w:b/>
                 <w:bCs/>
@@ -33020,7 +33082,7 @@
         </w:tc>
         <w:tc>
           <w:tcPr>
-            <w:tcW w:w="1516" w:type="dxa"/>
+            <w:tcW w:w="1044" w:type="dxa"/>
             <w:tcMar>
               <w:top w:w="30" w:type="dxa"/>
               <w:left w:w="45" w:type="dxa"/>
@@ -33032,6 +33094,8 @@
           </w:tcPr>
           <w:p>
             <w:pPr>
+              <w:spacing w:before="0" w:after="0"/>
+              <w:ind w:firstLine="0"/>
               <w:rPr>
                 <w:b/>
                 <w:bCs/>
@@ -33048,7 +33112,7 @@
         </w:tc>
         <w:tc>
           <w:tcPr>
-            <w:tcW w:w="1620" w:type="dxa"/>
+            <w:tcW w:w="1597" w:type="dxa"/>
             <w:tcMar>
               <w:top w:w="30" w:type="dxa"/>
               <w:left w:w="45" w:type="dxa"/>
@@ -33059,6 +33123,10 @@
             <w:hideMark/>
           </w:tcPr>
           <w:p>
+            <w:pPr>
+              <w:spacing w:before="0" w:after="0"/>
+              <w:ind w:firstLine="0"/>
+            </w:pPr>
             <w:r>
               <w:t>-5.9867***</w:t>
             </w:r>
@@ -33071,7 +33139,7 @@
         </w:trPr>
         <w:tc>
           <w:tcPr>
-            <w:tcW w:w="1535" w:type="dxa"/>
+            <w:tcW w:w="2340" w:type="dxa"/>
             <w:tcMar>
               <w:top w:w="30" w:type="dxa"/>
               <w:left w:w="45" w:type="dxa"/>
@@ -33082,6 +33150,10 @@
             <w:hideMark/>
           </w:tcPr>
           <w:p>
+            <w:pPr>
+              <w:spacing w:before="0" w:after="0"/>
+              <w:ind w:firstLine="0"/>
+            </w:pPr>
             <w:r>
               <w:t>Pgl348_EXS</w:t>
             </w:r>
@@ -33089,10 +33161,14 @@
         </w:tc>
         <w:tc>
           <w:tcPr>
-            <w:tcW w:w="1297" w:type="dxa"/>
-            <w:vAlign w:val="center"/>
-          </w:tcPr>
-          <w:p>
+            <w:tcW w:w="1701" w:type="dxa"/>
+            <w:vAlign w:val="center"/>
+          </w:tcPr>
+          <w:p>
+            <w:pPr>
+              <w:spacing w:before="0" w:after="0"/>
+              <w:ind w:firstLine="0"/>
+            </w:pPr>
             <w:r>
               <w:rPr>
                 <w:color w:val="000000"/>
@@ -33103,7 +33179,7 @@
         </w:tc>
         <w:tc>
           <w:tcPr>
-            <w:tcW w:w="1111" w:type="dxa"/>
+            <w:tcW w:w="1489" w:type="dxa"/>
             <w:tcMar>
               <w:top w:w="30" w:type="dxa"/>
               <w:left w:w="45" w:type="dxa"/>
@@ -33114,6 +33190,10 @@
             <w:hideMark/>
           </w:tcPr>
           <w:p>
+            <w:pPr>
+              <w:spacing w:before="0" w:after="0"/>
+              <w:ind w:firstLine="0"/>
+            </w:pPr>
             <w:r>
               <w:t>-0.435</w:t>
             </w:r>
@@ -33121,7 +33201,7 @@
         </w:tc>
         <w:tc>
           <w:tcPr>
-            <w:tcW w:w="1193" w:type="dxa"/>
+            <w:tcW w:w="1604" w:type="dxa"/>
             <w:gridSpan w:val="2"/>
             <w:tcMar>
               <w:top w:w="30" w:type="dxa"/>
@@ -33133,6 +33213,10 @@
             <w:hideMark/>
           </w:tcPr>
           <w:p>
+            <w:pPr>
+              <w:spacing w:before="0" w:after="0"/>
+              <w:ind w:firstLine="0"/>
+            </w:pPr>
             <w:r>
               <w:t>-0.4654</w:t>
             </w:r>
@@ -33140,7 +33224,7 @@
         </w:tc>
         <w:tc>
           <w:tcPr>
-            <w:tcW w:w="1516" w:type="dxa"/>
+            <w:tcW w:w="1044" w:type="dxa"/>
             <w:tcMar>
               <w:top w:w="30" w:type="dxa"/>
               <w:left w:w="45" w:type="dxa"/>
@@ -33152,6 +33236,8 @@
           </w:tcPr>
           <w:p>
             <w:pPr>
+              <w:spacing w:before="0" w:after="0"/>
+              <w:ind w:firstLine="0"/>
               <w:rPr>
                 <w:b/>
                 <w:bCs/>
@@ -33168,7 +33254,7 @@
         </w:tc>
         <w:tc>
           <w:tcPr>
-            <w:tcW w:w="1620" w:type="dxa"/>
+            <w:tcW w:w="1597" w:type="dxa"/>
             <w:tcMar>
               <w:top w:w="30" w:type="dxa"/>
               <w:left w:w="45" w:type="dxa"/>
@@ -33180,6 +33266,8 @@
           </w:tcPr>
           <w:p>
             <w:pPr>
+              <w:spacing w:before="0" w:after="0"/>
+              <w:ind w:firstLine="0"/>
               <w:rPr>
                 <w:b/>
                 <w:bCs/>
@@ -33201,7 +33289,7 @@
         </w:trPr>
         <w:tc>
           <w:tcPr>
-            <w:tcW w:w="1535" w:type="dxa"/>
+            <w:tcW w:w="2340" w:type="dxa"/>
             <w:tcMar>
               <w:top w:w="30" w:type="dxa"/>
               <w:left w:w="45" w:type="dxa"/>
@@ -33212,6 +33300,10 @@
             <w:hideMark/>
           </w:tcPr>
           <w:p>
+            <w:pPr>
+              <w:spacing w:before="0" w:after="0"/>
+              <w:ind w:firstLine="0"/>
+            </w:pPr>
             <w:r>
               <w:t>Pgl349_KY</w:t>
             </w:r>
@@ -33219,10 +33311,14 @@
         </w:tc>
         <w:tc>
           <w:tcPr>
-            <w:tcW w:w="1297" w:type="dxa"/>
-            <w:vAlign w:val="center"/>
-          </w:tcPr>
-          <w:p>
+            <w:tcW w:w="1701" w:type="dxa"/>
+            <w:vAlign w:val="center"/>
+          </w:tcPr>
+          <w:p>
+            <w:pPr>
+              <w:spacing w:before="0" w:after="0"/>
+              <w:ind w:firstLine="0"/>
+            </w:pPr>
             <w:r>
               <w:rPr>
                 <w:color w:val="000000"/>
@@ -33233,7 +33329,7 @@
         </w:tc>
         <w:tc>
           <w:tcPr>
-            <w:tcW w:w="1111" w:type="dxa"/>
+            <w:tcW w:w="1489" w:type="dxa"/>
             <w:tcMar>
               <w:top w:w="30" w:type="dxa"/>
               <w:left w:w="45" w:type="dxa"/>
@@ -33244,6 +33340,10 @@
             <w:hideMark/>
           </w:tcPr>
           <w:p>
+            <w:pPr>
+              <w:spacing w:before="0" w:after="0"/>
+              <w:ind w:firstLine="0"/>
+            </w:pPr>
             <w:r>
               <w:t>0.4141</w:t>
             </w:r>
@@ -33251,7 +33351,7 @@
         </w:tc>
         <w:tc>
           <w:tcPr>
-            <w:tcW w:w="1193" w:type="dxa"/>
+            <w:tcW w:w="1604" w:type="dxa"/>
             <w:gridSpan w:val="2"/>
             <w:tcMar>
               <w:top w:w="30" w:type="dxa"/>
@@ -33263,6 +33363,10 @@
             <w:hideMark/>
           </w:tcPr>
           <w:p>
+            <w:pPr>
+              <w:spacing w:before="0" w:after="0"/>
+              <w:ind w:firstLine="0"/>
+            </w:pPr>
             <w:r>
               <w:t>0.7621</w:t>
             </w:r>
@@ -33270,7 +33374,7 @@
         </w:tc>
         <w:tc>
           <w:tcPr>
-            <w:tcW w:w="1516" w:type="dxa"/>
+            <w:tcW w:w="1044" w:type="dxa"/>
             <w:tcMar>
               <w:top w:w="30" w:type="dxa"/>
               <w:left w:w="45" w:type="dxa"/>
@@ -33282,6 +33386,8 @@
           </w:tcPr>
           <w:p>
             <w:pPr>
+              <w:spacing w:before="0" w:after="0"/>
+              <w:ind w:firstLine="0"/>
               <w:rPr>
                 <w:b/>
                 <w:bCs/>
@@ -33298,7 +33404,7 @@
         </w:tc>
         <w:tc>
           <w:tcPr>
-            <w:tcW w:w="1620" w:type="dxa"/>
+            <w:tcW w:w="1597" w:type="dxa"/>
             <w:tcMar>
               <w:top w:w="30" w:type="dxa"/>
               <w:left w:w="45" w:type="dxa"/>
@@ -33310,6 +33416,8 @@
           </w:tcPr>
           <w:p>
             <w:pPr>
+              <w:spacing w:before="0" w:after="0"/>
+              <w:ind w:firstLine="0"/>
               <w:rPr>
                 <w:b/>
                 <w:bCs/>
@@ -33331,7 +33439,7 @@
         </w:trPr>
         <w:tc>
           <w:tcPr>
-            <w:tcW w:w="1535" w:type="dxa"/>
+            <w:tcW w:w="2340" w:type="dxa"/>
             <w:tcMar>
               <w:top w:w="30" w:type="dxa"/>
               <w:left w:w="45" w:type="dxa"/>
@@ -33342,6 +33450,10 @@
             <w:hideMark/>
           </w:tcPr>
           <w:p>
+            <w:pPr>
+              <w:spacing w:before="0" w:after="0"/>
+              <w:ind w:firstLine="0"/>
+            </w:pPr>
             <w:r>
               <w:t>Pgl350_KY</w:t>
             </w:r>
@@ -33349,10 +33461,14 @@
         </w:tc>
         <w:tc>
           <w:tcPr>
-            <w:tcW w:w="1297" w:type="dxa"/>
-            <w:vAlign w:val="center"/>
-          </w:tcPr>
-          <w:p>
+            <w:tcW w:w="1701" w:type="dxa"/>
+            <w:vAlign w:val="center"/>
+          </w:tcPr>
+          <w:p>
+            <w:pPr>
+              <w:spacing w:before="0" w:after="0"/>
+              <w:ind w:firstLine="0"/>
+            </w:pPr>
             <w:r>
               <w:rPr>
                 <w:color w:val="000000"/>
@@ -33363,7 +33479,7 @@
         </w:tc>
         <w:tc>
           <w:tcPr>
-            <w:tcW w:w="1111" w:type="dxa"/>
+            <w:tcW w:w="1489" w:type="dxa"/>
             <w:tcMar>
               <w:top w:w="30" w:type="dxa"/>
               <w:left w:w="45" w:type="dxa"/>
@@ -33374,6 +33490,10 @@
             <w:hideMark/>
           </w:tcPr>
           <w:p>
+            <w:pPr>
+              <w:spacing w:before="0" w:after="0"/>
+              <w:ind w:firstLine="0"/>
+            </w:pPr>
             <w:r>
               <w:t>0.5647</w:t>
             </w:r>
@@ -33381,7 +33501,7 @@
         </w:tc>
         <w:tc>
           <w:tcPr>
-            <w:tcW w:w="1193" w:type="dxa"/>
+            <w:tcW w:w="1604" w:type="dxa"/>
             <w:gridSpan w:val="2"/>
             <w:tcMar>
               <w:top w:w="30" w:type="dxa"/>
@@ -33393,6 +33513,10 @@
             <w:hideMark/>
           </w:tcPr>
           <w:p>
+            <w:pPr>
+              <w:spacing w:before="0" w:after="0"/>
+              <w:ind w:firstLine="0"/>
+            </w:pPr>
             <w:r>
               <w:t>1.3961</w:t>
             </w:r>
@@ -33400,7 +33524,7 @@
         </w:tc>
         <w:tc>
           <w:tcPr>
-            <w:tcW w:w="1516" w:type="dxa"/>
+            <w:tcW w:w="1044" w:type="dxa"/>
             <w:tcMar>
               <w:top w:w="30" w:type="dxa"/>
               <w:left w:w="45" w:type="dxa"/>
@@ -33412,6 +33536,8 @@
           </w:tcPr>
           <w:p>
             <w:pPr>
+              <w:spacing w:before="0" w:after="0"/>
+              <w:ind w:firstLine="0"/>
               <w:rPr>
                 <w:b/>
                 <w:bCs/>
@@ -33428,7 +33554,7 @@
         </w:tc>
         <w:tc>
           <w:tcPr>
-            <w:tcW w:w="1620" w:type="dxa"/>
+            <w:tcW w:w="1597" w:type="dxa"/>
             <w:tcMar>
               <w:top w:w="30" w:type="dxa"/>
               <w:left w:w="45" w:type="dxa"/>
@@ -33440,6 +33566,8 @@
           </w:tcPr>
           <w:p>
             <w:pPr>
+              <w:spacing w:before="0" w:after="0"/>
+              <w:ind w:firstLine="0"/>
               <w:rPr>
                 <w:b/>
                 <w:bCs/>
@@ -33461,7 +33589,7 @@
         </w:trPr>
         <w:tc>
           <w:tcPr>
-            <w:tcW w:w="1535" w:type="dxa"/>
+            <w:tcW w:w="2340" w:type="dxa"/>
             <w:tcMar>
               <w:top w:w="30" w:type="dxa"/>
               <w:left w:w="45" w:type="dxa"/>
@@ -33472,6 +33600,10 @@
             <w:hideMark/>
           </w:tcPr>
           <w:p>
+            <w:pPr>
+              <w:spacing w:before="0" w:after="0"/>
+              <w:ind w:firstLine="0"/>
+            </w:pPr>
             <w:r>
               <w:t>Pgl351_KY</w:t>
             </w:r>
@@ -33479,10 +33611,14 @@
         </w:tc>
         <w:tc>
           <w:tcPr>
-            <w:tcW w:w="1297" w:type="dxa"/>
-            <w:vAlign w:val="center"/>
-          </w:tcPr>
-          <w:p>
+            <w:tcW w:w="1701" w:type="dxa"/>
+            <w:vAlign w:val="center"/>
+          </w:tcPr>
+          <w:p>
+            <w:pPr>
+              <w:spacing w:before="0" w:after="0"/>
+              <w:ind w:firstLine="0"/>
+            </w:pPr>
             <w:r>
               <w:rPr>
                 <w:color w:val="000000"/>
@@ -33493,7 +33629,7 @@
         </w:tc>
         <w:tc>
           <w:tcPr>
-            <w:tcW w:w="1111" w:type="dxa"/>
+            <w:tcW w:w="1489" w:type="dxa"/>
             <w:tcMar>
               <w:top w:w="30" w:type="dxa"/>
               <w:left w:w="45" w:type="dxa"/>
@@ -33504,6 +33640,10 @@
             <w:hideMark/>
           </w:tcPr>
           <w:p>
+            <w:pPr>
+              <w:spacing w:before="0" w:after="0"/>
+              <w:ind w:firstLine="0"/>
+            </w:pPr>
             <w:r>
               <w:t>-2.5474</w:t>
             </w:r>
@@ -33511,7 +33651,7 @@
         </w:tc>
         <w:tc>
           <w:tcPr>
-            <w:tcW w:w="1193" w:type="dxa"/>
+            <w:tcW w:w="1604" w:type="dxa"/>
             <w:gridSpan w:val="2"/>
             <w:tcMar>
               <w:top w:w="30" w:type="dxa"/>
@@ -33523,6 +33663,10 @@
             <w:hideMark/>
           </w:tcPr>
           <w:p>
+            <w:pPr>
+              <w:spacing w:before="0" w:after="0"/>
+              <w:ind w:firstLine="0"/>
+            </w:pPr>
             <w:r>
               <w:t>-0.8928</w:t>
             </w:r>
@@ -33530,7 +33674,7 @@
         </w:tc>
         <w:tc>
           <w:tcPr>
-            <w:tcW w:w="1516" w:type="dxa"/>
+            <w:tcW w:w="1044" w:type="dxa"/>
             <w:tcMar>
               <w:top w:w="30" w:type="dxa"/>
               <w:left w:w="45" w:type="dxa"/>
@@ -33542,6 +33686,8 @@
           </w:tcPr>
           <w:p>
             <w:pPr>
+              <w:spacing w:before="0" w:after="0"/>
+              <w:ind w:firstLine="0"/>
               <w:rPr>
                 <w:b/>
                 <w:bCs/>
@@ -33558,7 +33704,7 @@
         </w:tc>
         <w:tc>
           <w:tcPr>
-            <w:tcW w:w="1620" w:type="dxa"/>
+            <w:tcW w:w="1597" w:type="dxa"/>
             <w:tcMar>
               <w:top w:w="30" w:type="dxa"/>
               <w:left w:w="45" w:type="dxa"/>
@@ -33570,6 +33716,8 @@
           </w:tcPr>
           <w:p>
             <w:pPr>
+              <w:spacing w:before="0" w:after="0"/>
+              <w:ind w:firstLine="0"/>
               <w:rPr>
                 <w:b/>
                 <w:bCs/>
@@ -33591,7 +33739,7 @@
         </w:trPr>
         <w:tc>
           <w:tcPr>
-            <w:tcW w:w="1535" w:type="dxa"/>
+            <w:tcW w:w="2340" w:type="dxa"/>
             <w:tcMar>
               <w:top w:w="30" w:type="dxa"/>
               <w:left w:w="45" w:type="dxa"/>
@@ -33603,6 +33751,8 @@
           </w:tcPr>
           <w:p>
             <w:pPr>
+              <w:spacing w:before="0" w:after="0"/>
+              <w:ind w:firstLine="0"/>
               <w:rPr>
                 <w:b/>
                 <w:bCs/>
@@ -33615,10 +33765,14 @@
         </w:tc>
         <w:tc>
           <w:tcPr>
-            <w:tcW w:w="1297" w:type="dxa"/>
-            <w:vAlign w:val="center"/>
-          </w:tcPr>
-          <w:p>
+            <w:tcW w:w="1701" w:type="dxa"/>
+            <w:vAlign w:val="center"/>
+          </w:tcPr>
+          <w:p>
+            <w:pPr>
+              <w:spacing w:before="0" w:after="0"/>
+              <w:ind w:firstLine="0"/>
+            </w:pPr>
             <w:r>
               <w:rPr>
                 <w:color w:val="000000"/>
@@ -33629,7 +33783,7 @@
         </w:tc>
         <w:tc>
           <w:tcPr>
-            <w:tcW w:w="1111" w:type="dxa"/>
+            <w:tcW w:w="1489" w:type="dxa"/>
             <w:tcMar>
               <w:top w:w="30" w:type="dxa"/>
               <w:left w:w="45" w:type="dxa"/>
@@ -33640,6 +33794,10 @@
             <w:hideMark/>
           </w:tcPr>
           <w:p>
+            <w:pPr>
+              <w:spacing w:before="0" w:after="0"/>
+              <w:ind w:firstLine="0"/>
+            </w:pPr>
             <w:r>
               <w:t>1.5215</w:t>
             </w:r>
@@ -33647,7 +33805,7 @@
         </w:tc>
         <w:tc>
           <w:tcPr>
-            <w:tcW w:w="1193" w:type="dxa"/>
+            <w:tcW w:w="1604" w:type="dxa"/>
             <w:gridSpan w:val="2"/>
             <w:tcMar>
               <w:top w:w="30" w:type="dxa"/>
@@ -33660,6 +33818,8 @@
           </w:tcPr>
           <w:p>
             <w:pPr>
+              <w:spacing w:before="0" w:after="0"/>
+              <w:ind w:firstLine="0"/>
               <w:rPr>
                 <w:b/>
                 <w:bCs/>
@@ -33676,7 +33836,7 @@
         </w:tc>
         <w:tc>
           <w:tcPr>
-            <w:tcW w:w="1516" w:type="dxa"/>
+            <w:tcW w:w="1044" w:type="dxa"/>
             <w:tcMar>
               <w:top w:w="30" w:type="dxa"/>
               <w:left w:w="45" w:type="dxa"/>
@@ -33688,6 +33848,8 @@
           </w:tcPr>
           <w:p>
             <w:pPr>
+              <w:spacing w:before="0" w:after="0"/>
+              <w:ind w:firstLine="0"/>
               <w:rPr>
                 <w:b/>
                 <w:bCs/>
@@ -33704,7 +33866,7 @@
         </w:tc>
         <w:tc>
           <w:tcPr>
-            <w:tcW w:w="1620" w:type="dxa"/>
+            <w:tcW w:w="1597" w:type="dxa"/>
             <w:tcMar>
               <w:top w:w="30" w:type="dxa"/>
               <w:left w:w="45" w:type="dxa"/>
@@ -33716,6 +33878,8 @@
           </w:tcPr>
           <w:p>
             <w:pPr>
+              <w:spacing w:before="0" w:after="0"/>
+              <w:ind w:firstLine="0"/>
               <w:rPr>
                 <w:b/>
                 <w:bCs/>
@@ -33737,7 +33901,7 @@
         </w:trPr>
         <w:tc>
           <w:tcPr>
-            <w:tcW w:w="1535" w:type="dxa"/>
+            <w:tcW w:w="2340" w:type="dxa"/>
             <w:tcMar>
               <w:top w:w="30" w:type="dxa"/>
               <w:left w:w="45" w:type="dxa"/>
@@ -33749,24 +33913,27 @@
           </w:tcPr>
           <w:p>
             <w:pPr>
+              <w:spacing w:before="0" w:after="0"/>
+              <w:ind w:firstLine="0"/>
               <w:rPr>
                 <w:b/>
                 <w:bCs/>
               </w:rPr>
             </w:pPr>
             <w:r>
-              <w:lastRenderedPageBreak/>
               <w:t>Pgl353_EXS</w:t>
             </w:r>
           </w:p>
         </w:tc>
         <w:tc>
           <w:tcPr>
-            <w:tcW w:w="1297" w:type="dxa"/>
-            <w:vAlign w:val="center"/>
-          </w:tcPr>
-          <w:p>
-            <w:pPr>
+            <w:tcW w:w="1701" w:type="dxa"/>
+            <w:vAlign w:val="center"/>
+          </w:tcPr>
+          <w:p>
+            <w:pPr>
+              <w:spacing w:before="0" w:after="0"/>
+              <w:ind w:firstLine="0"/>
               <w:rPr>
                 <w:b/>
                 <w:bCs/>
@@ -33782,7 +33949,7 @@
         </w:tc>
         <w:tc>
           <w:tcPr>
-            <w:tcW w:w="1111" w:type="dxa"/>
+            <w:tcW w:w="1489" w:type="dxa"/>
             <w:tcMar>
               <w:top w:w="30" w:type="dxa"/>
               <w:left w:w="45" w:type="dxa"/>
@@ -33794,6 +33961,8 @@
           </w:tcPr>
           <w:p>
             <w:pPr>
+              <w:spacing w:before="0" w:after="0"/>
+              <w:ind w:firstLine="0"/>
               <w:rPr>
                 <w:b/>
                 <w:bCs/>
@@ -33810,7 +33979,7 @@
         </w:tc>
         <w:tc>
           <w:tcPr>
-            <w:tcW w:w="1193" w:type="dxa"/>
+            <w:tcW w:w="1604" w:type="dxa"/>
             <w:gridSpan w:val="2"/>
             <w:tcMar>
               <w:top w:w="30" w:type="dxa"/>
@@ -33823,6 +33992,8 @@
           </w:tcPr>
           <w:p>
             <w:pPr>
+              <w:spacing w:before="0" w:after="0"/>
+              <w:ind w:firstLine="0"/>
               <w:rPr>
                 <w:b/>
                 <w:bCs/>
@@ -33839,7 +34010,7 @@
         </w:tc>
         <w:tc>
           <w:tcPr>
-            <w:tcW w:w="1516" w:type="dxa"/>
+            <w:tcW w:w="1044" w:type="dxa"/>
             <w:tcMar>
               <w:top w:w="30" w:type="dxa"/>
               <w:left w:w="45" w:type="dxa"/>
@@ -33851,6 +34022,8 @@
           </w:tcPr>
           <w:p>
             <w:pPr>
+              <w:spacing w:before="0" w:after="0"/>
+              <w:ind w:firstLine="0"/>
               <w:rPr>
                 <w:b/>
                 <w:bCs/>
@@ -33867,7 +34040,7 @@
         </w:tc>
         <w:tc>
           <w:tcPr>
-            <w:tcW w:w="1620" w:type="dxa"/>
+            <w:tcW w:w="1597" w:type="dxa"/>
             <w:tcMar>
               <w:top w:w="30" w:type="dxa"/>
               <w:left w:w="45" w:type="dxa"/>
@@ -33879,6 +34052,8 @@
           </w:tcPr>
           <w:p>
             <w:pPr>
+              <w:spacing w:before="0" w:after="0"/>
+              <w:ind w:firstLine="0"/>
               <w:rPr>
                 <w:b/>
                 <w:bCs/>
@@ -33900,7 +34075,7 @@
         </w:trPr>
         <w:tc>
           <w:tcPr>
-            <w:tcW w:w="1535" w:type="dxa"/>
+            <w:tcW w:w="2340" w:type="dxa"/>
             <w:tcMar>
               <w:top w:w="30" w:type="dxa"/>
               <w:left w:w="45" w:type="dxa"/>
@@ -33911,6 +34086,10 @@
             <w:hideMark/>
           </w:tcPr>
           <w:p>
+            <w:pPr>
+              <w:spacing w:before="0" w:after="0"/>
+              <w:ind w:firstLine="0"/>
+            </w:pPr>
             <w:r>
               <w:t>Pgl354_KY</w:t>
             </w:r>
@@ -33918,10 +34097,14 @@
         </w:tc>
         <w:tc>
           <w:tcPr>
-            <w:tcW w:w="1297" w:type="dxa"/>
-            <w:vAlign w:val="center"/>
-          </w:tcPr>
-          <w:p>
+            <w:tcW w:w="1701" w:type="dxa"/>
+            <w:vAlign w:val="center"/>
+          </w:tcPr>
+          <w:p>
+            <w:pPr>
+              <w:spacing w:before="0" w:after="0"/>
+              <w:ind w:firstLine="0"/>
+            </w:pPr>
             <w:r>
               <w:rPr>
                 <w:color w:val="000000"/>
@@ -33932,7 +34115,7 @@
         </w:tc>
         <w:tc>
           <w:tcPr>
-            <w:tcW w:w="1111" w:type="dxa"/>
+            <w:tcW w:w="1489" w:type="dxa"/>
             <w:tcMar>
               <w:top w:w="30" w:type="dxa"/>
               <w:left w:w="45" w:type="dxa"/>
@@ -33943,6 +34126,10 @@
             <w:hideMark/>
           </w:tcPr>
           <w:p>
+            <w:pPr>
+              <w:spacing w:before="0" w:after="0"/>
+              <w:ind w:firstLine="0"/>
+            </w:pPr>
             <w:r>
               <w:t>0.3876</w:t>
             </w:r>
@@ -33950,7 +34137,7 @@
         </w:tc>
         <w:tc>
           <w:tcPr>
-            <w:tcW w:w="1193" w:type="dxa"/>
+            <w:tcW w:w="1604" w:type="dxa"/>
             <w:gridSpan w:val="2"/>
             <w:tcMar>
               <w:top w:w="30" w:type="dxa"/>
@@ -33962,6 +34149,10 @@
             <w:hideMark/>
           </w:tcPr>
           <w:p>
+            <w:pPr>
+              <w:spacing w:before="0" w:after="0"/>
+              <w:ind w:firstLine="0"/>
+            </w:pPr>
             <w:r>
               <w:t>1.1927</w:t>
             </w:r>
@@ -33969,7 +34160,7 @@
         </w:tc>
         <w:tc>
           <w:tcPr>
-            <w:tcW w:w="1516" w:type="dxa"/>
+            <w:tcW w:w="1044" w:type="dxa"/>
             <w:tcMar>
               <w:top w:w="30" w:type="dxa"/>
               <w:left w:w="45" w:type="dxa"/>
@@ -33981,6 +34172,8 @@
           </w:tcPr>
           <w:p>
             <w:pPr>
+              <w:spacing w:before="0" w:after="0"/>
+              <w:ind w:firstLine="0"/>
               <w:rPr>
                 <w:b/>
                 <w:bCs/>
@@ -33997,7 +34190,7 @@
         </w:tc>
         <w:tc>
           <w:tcPr>
-            <w:tcW w:w="1620" w:type="dxa"/>
+            <w:tcW w:w="1597" w:type="dxa"/>
             <w:tcMar>
               <w:top w:w="30" w:type="dxa"/>
               <w:left w:w="45" w:type="dxa"/>
@@ -34009,6 +34202,8 @@
           </w:tcPr>
           <w:p>
             <w:pPr>
+              <w:spacing w:before="0" w:after="0"/>
+              <w:ind w:firstLine="0"/>
               <w:rPr>
                 <w:b/>
                 <w:bCs/>
@@ -34030,7 +34225,7 @@
         </w:trPr>
         <w:tc>
           <w:tcPr>
-            <w:tcW w:w="1535" w:type="dxa"/>
+            <w:tcW w:w="2340" w:type="dxa"/>
             <w:tcMar>
               <w:top w:w="30" w:type="dxa"/>
               <w:left w:w="45" w:type="dxa"/>
@@ -34041,6 +34236,10 @@
             <w:hideMark/>
           </w:tcPr>
           <w:p>
+            <w:pPr>
+              <w:spacing w:before="0" w:after="0"/>
+              <w:ind w:firstLine="0"/>
+            </w:pPr>
             <w:r>
               <w:t>Pgl355_EXS</w:t>
             </w:r>
@@ -34048,10 +34247,14 @@
         </w:tc>
         <w:tc>
           <w:tcPr>
-            <w:tcW w:w="1297" w:type="dxa"/>
-            <w:vAlign w:val="center"/>
-          </w:tcPr>
-          <w:p>
+            <w:tcW w:w="1701" w:type="dxa"/>
+            <w:vAlign w:val="center"/>
+          </w:tcPr>
+          <w:p>
+            <w:pPr>
+              <w:spacing w:before="0" w:after="0"/>
+              <w:ind w:firstLine="0"/>
+            </w:pPr>
             <w:r>
               <w:rPr>
                 <w:color w:val="000000"/>
@@ -34062,7 +34265,7 @@
         </w:tc>
         <w:tc>
           <w:tcPr>
-            <w:tcW w:w="1111" w:type="dxa"/>
+            <w:tcW w:w="1489" w:type="dxa"/>
             <w:tcMar>
               <w:top w:w="30" w:type="dxa"/>
               <w:left w:w="45" w:type="dxa"/>
@@ -34073,6 +34276,10 @@
             <w:hideMark/>
           </w:tcPr>
           <w:p>
+            <w:pPr>
+              <w:spacing w:before="0" w:after="0"/>
+              <w:ind w:firstLine="0"/>
+            </w:pPr>
             <w:r>
               <w:t>-3.8833</w:t>
             </w:r>
@@ -34080,7 +34287,7 @@
         </w:tc>
         <w:tc>
           <w:tcPr>
-            <w:tcW w:w="1193" w:type="dxa"/>
+            <w:tcW w:w="1604" w:type="dxa"/>
             <w:gridSpan w:val="2"/>
             <w:tcMar>
               <w:top w:w="30" w:type="dxa"/>
@@ -34092,6 +34299,10 @@
             <w:hideMark/>
           </w:tcPr>
           <w:p>
+            <w:pPr>
+              <w:spacing w:before="0" w:after="0"/>
+              <w:ind w:firstLine="0"/>
+            </w:pPr>
             <w:r>
               <w:t>-1.3018</w:t>
             </w:r>
@@ -34099,7 +34310,7 @@
         </w:tc>
         <w:tc>
           <w:tcPr>
-            <w:tcW w:w="1516" w:type="dxa"/>
+            <w:tcW w:w="1044" w:type="dxa"/>
             <w:tcMar>
               <w:top w:w="30" w:type="dxa"/>
               <w:left w:w="45" w:type="dxa"/>
@@ -34111,6 +34322,8 @@
           </w:tcPr>
           <w:p>
             <w:pPr>
+              <w:spacing w:before="0" w:after="0"/>
+              <w:ind w:firstLine="0"/>
               <w:rPr>
                 <w:b/>
                 <w:bCs/>
@@ -34127,7 +34340,7 @@
         </w:tc>
         <w:tc>
           <w:tcPr>
-            <w:tcW w:w="1620" w:type="dxa"/>
+            <w:tcW w:w="1597" w:type="dxa"/>
             <w:tcMar>
               <w:top w:w="30" w:type="dxa"/>
               <w:left w:w="45" w:type="dxa"/>
@@ -34139,6 +34352,8 @@
           </w:tcPr>
           <w:p>
             <w:pPr>
+              <w:spacing w:before="0" w:after="0"/>
+              <w:ind w:firstLine="0"/>
               <w:rPr>
                 <w:b/>
                 <w:bCs/>
@@ -34160,7 +34375,7 @@
         </w:trPr>
         <w:tc>
           <w:tcPr>
-            <w:tcW w:w="1535" w:type="dxa"/>
+            <w:tcW w:w="2340" w:type="dxa"/>
             <w:tcMar>
               <w:top w:w="30" w:type="dxa"/>
               <w:left w:w="45" w:type="dxa"/>
@@ -34171,17 +34386,26 @@
             <w:hideMark/>
           </w:tcPr>
           <w:p>
-            <w:r>
+            <w:pPr>
+              <w:spacing w:before="0" w:after="0"/>
+              <w:ind w:firstLine="0"/>
+            </w:pPr>
+            <w:r>
+              <w:lastRenderedPageBreak/>
               <w:t>Pgl356_TNE</w:t>
             </w:r>
           </w:p>
         </w:tc>
         <w:tc>
           <w:tcPr>
-            <w:tcW w:w="1297" w:type="dxa"/>
-            <w:vAlign w:val="center"/>
-          </w:tcPr>
-          <w:p>
+            <w:tcW w:w="1701" w:type="dxa"/>
+            <w:vAlign w:val="center"/>
+          </w:tcPr>
+          <w:p>
+            <w:pPr>
+              <w:spacing w:before="0" w:after="0"/>
+              <w:ind w:firstLine="0"/>
+            </w:pPr>
             <w:r>
               <w:rPr>
                 <w:color w:val="000000"/>
@@ -34192,7 +34416,7 @@
         </w:tc>
         <w:tc>
           <w:tcPr>
-            <w:tcW w:w="1111" w:type="dxa"/>
+            <w:tcW w:w="1489" w:type="dxa"/>
             <w:tcMar>
               <w:top w:w="30" w:type="dxa"/>
               <w:left w:w="45" w:type="dxa"/>
@@ -34203,6 +34427,10 @@
             <w:hideMark/>
           </w:tcPr>
           <w:p>
+            <w:pPr>
+              <w:spacing w:before="0" w:after="0"/>
+              <w:ind w:firstLine="0"/>
+            </w:pPr>
             <w:r>
               <w:t>-0.3931</w:t>
             </w:r>
@@ -34210,7 +34438,7 @@
         </w:tc>
         <w:tc>
           <w:tcPr>
-            <w:tcW w:w="1193" w:type="dxa"/>
+            <w:tcW w:w="1604" w:type="dxa"/>
             <w:gridSpan w:val="2"/>
             <w:tcMar>
               <w:top w:w="30" w:type="dxa"/>
@@ -34222,6 +34450,10 @@
             <w:hideMark/>
           </w:tcPr>
           <w:p>
+            <w:pPr>
+              <w:spacing w:before="0" w:after="0"/>
+              <w:ind w:firstLine="0"/>
+            </w:pPr>
             <w:r>
               <w:t>-0.5112</w:t>
             </w:r>
@@ -34229,7 +34461,7 @@
         </w:tc>
         <w:tc>
           <w:tcPr>
-            <w:tcW w:w="1516" w:type="dxa"/>
+            <w:tcW w:w="1044" w:type="dxa"/>
             <w:tcMar>
               <w:top w:w="30" w:type="dxa"/>
               <w:left w:w="45" w:type="dxa"/>
@@ -34241,6 +34473,8 @@
           </w:tcPr>
           <w:p>
             <w:pPr>
+              <w:spacing w:before="0" w:after="0"/>
+              <w:ind w:firstLine="0"/>
               <w:rPr>
                 <w:b/>
                 <w:bCs/>
@@ -34257,7 +34491,7 @@
         </w:tc>
         <w:tc>
           <w:tcPr>
-            <w:tcW w:w="1620" w:type="dxa"/>
+            <w:tcW w:w="1597" w:type="dxa"/>
             <w:tcMar>
               <w:top w:w="30" w:type="dxa"/>
               <w:left w:w="45" w:type="dxa"/>
@@ -34269,6 +34503,8 @@
           </w:tcPr>
           <w:p>
             <w:pPr>
+              <w:spacing w:before="0" w:after="0"/>
+              <w:ind w:firstLine="0"/>
               <w:rPr>
                 <w:b/>
                 <w:bCs/>
@@ -34290,7 +34526,7 @@
         </w:trPr>
         <w:tc>
           <w:tcPr>
-            <w:tcW w:w="1535" w:type="dxa"/>
+            <w:tcW w:w="2340" w:type="dxa"/>
             <w:tcMar>
               <w:top w:w="30" w:type="dxa"/>
               <w:left w:w="45" w:type="dxa"/>
@@ -34302,6 +34538,8 @@
           </w:tcPr>
           <w:p>
             <w:pPr>
+              <w:spacing w:before="0" w:after="0"/>
+              <w:ind w:firstLine="0"/>
               <w:rPr>
                 <w:b/>
                 <w:bCs/>
@@ -34314,11 +34552,13 @@
         </w:tc>
         <w:tc>
           <w:tcPr>
-            <w:tcW w:w="1297" w:type="dxa"/>
-            <w:vAlign w:val="center"/>
-          </w:tcPr>
-          <w:p>
-            <w:pPr>
+            <w:tcW w:w="1701" w:type="dxa"/>
+            <w:vAlign w:val="center"/>
+          </w:tcPr>
+          <w:p>
+            <w:pPr>
+              <w:spacing w:before="0" w:after="0"/>
+              <w:ind w:firstLine="0"/>
               <w:rPr>
                 <w:b/>
                 <w:bCs/>
@@ -34334,7 +34574,7 @@
         </w:tc>
         <w:tc>
           <w:tcPr>
-            <w:tcW w:w="1111" w:type="dxa"/>
+            <w:tcW w:w="1489" w:type="dxa"/>
             <w:tcMar>
               <w:top w:w="30" w:type="dxa"/>
               <w:left w:w="45" w:type="dxa"/>
@@ -34346,6 +34586,8 @@
           </w:tcPr>
           <w:p>
             <w:pPr>
+              <w:spacing w:before="0" w:after="0"/>
+              <w:ind w:firstLine="0"/>
               <w:rPr>
                 <w:b/>
                 <w:bCs/>
@@ -34362,7 +34604,7 @@
         </w:tc>
         <w:tc>
           <w:tcPr>
-            <w:tcW w:w="1193" w:type="dxa"/>
+            <w:tcW w:w="1604" w:type="dxa"/>
             <w:gridSpan w:val="2"/>
             <w:tcMar>
               <w:top w:w="30" w:type="dxa"/>
@@ -34375,6 +34617,8 @@
           </w:tcPr>
           <w:p>
             <w:pPr>
+              <w:spacing w:before="0" w:after="0"/>
+              <w:ind w:firstLine="0"/>
               <w:rPr>
                 <w:b/>
                 <w:bCs/>
@@ -34391,7 +34635,7 @@
         </w:tc>
         <w:tc>
           <w:tcPr>
-            <w:tcW w:w="1516" w:type="dxa"/>
+            <w:tcW w:w="1044" w:type="dxa"/>
             <w:tcMar>
               <w:top w:w="30" w:type="dxa"/>
               <w:left w:w="45" w:type="dxa"/>
@@ -34403,6 +34647,8 @@
           </w:tcPr>
           <w:p>
             <w:pPr>
+              <w:spacing w:before="0" w:after="0"/>
+              <w:ind w:firstLine="0"/>
               <w:rPr>
                 <w:b/>
                 <w:bCs/>
@@ -34419,7 +34665,7 @@
         </w:tc>
         <w:tc>
           <w:tcPr>
-            <w:tcW w:w="1620" w:type="dxa"/>
+            <w:tcW w:w="1597" w:type="dxa"/>
             <w:tcMar>
               <w:top w:w="30" w:type="dxa"/>
               <w:left w:w="45" w:type="dxa"/>
@@ -34431,6 +34677,8 @@
           </w:tcPr>
           <w:p>
             <w:pPr>
+              <w:spacing w:before="0" w:after="0"/>
+              <w:ind w:firstLine="0"/>
               <w:rPr>
                 <w:b/>
                 <w:bCs/>
@@ -34452,7 +34700,7 @@
         </w:trPr>
         <w:tc>
           <w:tcPr>
-            <w:tcW w:w="1535" w:type="dxa"/>
+            <w:tcW w:w="2340" w:type="dxa"/>
             <w:tcMar>
               <w:top w:w="30" w:type="dxa"/>
               <w:left w:w="45" w:type="dxa"/>
@@ -34463,6 +34711,10 @@
             <w:hideMark/>
           </w:tcPr>
           <w:p>
+            <w:pPr>
+              <w:spacing w:before="0" w:after="0"/>
+              <w:ind w:firstLine="0"/>
+            </w:pPr>
             <w:r>
               <w:t>Pgl358_TNW</w:t>
             </w:r>
@@ -34470,10 +34722,14 @@
         </w:tc>
         <w:tc>
           <w:tcPr>
-            <w:tcW w:w="1297" w:type="dxa"/>
-            <w:vAlign w:val="center"/>
-          </w:tcPr>
-          <w:p>
+            <w:tcW w:w="1701" w:type="dxa"/>
+            <w:vAlign w:val="center"/>
+          </w:tcPr>
+          <w:p>
+            <w:pPr>
+              <w:spacing w:before="0" w:after="0"/>
+              <w:ind w:firstLine="0"/>
+            </w:pPr>
             <w:r>
               <w:rPr>
                 <w:color w:val="000000"/>
@@ -34484,7 +34740,7 @@
         </w:tc>
         <w:tc>
           <w:tcPr>
-            <w:tcW w:w="1111" w:type="dxa"/>
+            <w:tcW w:w="1489" w:type="dxa"/>
             <w:tcMar>
               <w:top w:w="30" w:type="dxa"/>
               <w:left w:w="45" w:type="dxa"/>
@@ -34495,6 +34751,10 @@
             <w:hideMark/>
           </w:tcPr>
           <w:p>
+            <w:pPr>
+              <w:spacing w:before="0" w:after="0"/>
+              <w:ind w:firstLine="0"/>
+            </w:pPr>
             <w:r>
               <w:t>-1.5086</w:t>
             </w:r>
@@ -34502,7 +34762,7 @@
         </w:tc>
         <w:tc>
           <w:tcPr>
-            <w:tcW w:w="1193" w:type="dxa"/>
+            <w:tcW w:w="1604" w:type="dxa"/>
             <w:gridSpan w:val="2"/>
             <w:tcMar>
               <w:top w:w="30" w:type="dxa"/>
@@ -34514,6 +34774,10 @@
             <w:hideMark/>
           </w:tcPr>
           <w:p>
+            <w:pPr>
+              <w:spacing w:before="0" w:after="0"/>
+              <w:ind w:firstLine="0"/>
+            </w:pPr>
             <w:r>
               <w:t>-0.4497</w:t>
             </w:r>
@@ -34521,7 +34785,7 @@
         </w:tc>
         <w:tc>
           <w:tcPr>
-            <w:tcW w:w="1516" w:type="dxa"/>
+            <w:tcW w:w="1044" w:type="dxa"/>
             <w:tcMar>
               <w:top w:w="30" w:type="dxa"/>
               <w:left w:w="45" w:type="dxa"/>
@@ -34533,6 +34797,8 @@
           </w:tcPr>
           <w:p>
             <w:pPr>
+              <w:spacing w:before="0" w:after="0"/>
+              <w:ind w:firstLine="0"/>
               <w:rPr>
                 <w:b/>
                 <w:bCs/>
@@ -34549,7 +34815,7 @@
         </w:tc>
         <w:tc>
           <w:tcPr>
-            <w:tcW w:w="1620" w:type="dxa"/>
+            <w:tcW w:w="1597" w:type="dxa"/>
             <w:tcMar>
               <w:top w:w="30" w:type="dxa"/>
               <w:left w:w="45" w:type="dxa"/>
@@ -34561,6 +34827,8 @@
           </w:tcPr>
           <w:p>
             <w:pPr>
+              <w:spacing w:before="0" w:after="0"/>
+              <w:ind w:firstLine="0"/>
               <w:rPr>
                 <w:b/>
                 <w:bCs/>
@@ -34582,7 +34850,7 @@
         </w:trPr>
         <w:tc>
           <w:tcPr>
-            <w:tcW w:w="1535" w:type="dxa"/>
+            <w:tcW w:w="2340" w:type="dxa"/>
             <w:tcMar>
               <w:top w:w="30" w:type="dxa"/>
               <w:left w:w="45" w:type="dxa"/>
@@ -34593,6 +34861,10 @@
             <w:hideMark/>
           </w:tcPr>
           <w:p>
+            <w:pPr>
+              <w:spacing w:before="0" w:after="0"/>
+              <w:ind w:firstLine="0"/>
+            </w:pPr>
             <w:r>
               <w:t>Pgl359_TNW</w:t>
             </w:r>
@@ -34600,10 +34872,14 @@
         </w:tc>
         <w:tc>
           <w:tcPr>
-            <w:tcW w:w="1297" w:type="dxa"/>
-            <w:vAlign w:val="center"/>
-          </w:tcPr>
-          <w:p>
+            <w:tcW w:w="1701" w:type="dxa"/>
+            <w:vAlign w:val="center"/>
+          </w:tcPr>
+          <w:p>
+            <w:pPr>
+              <w:spacing w:before="0" w:after="0"/>
+              <w:ind w:firstLine="0"/>
+            </w:pPr>
             <w:r>
               <w:rPr>
                 <w:color w:val="000000"/>
@@ -34614,7 +34890,7 @@
         </w:tc>
         <w:tc>
           <w:tcPr>
-            <w:tcW w:w="1111" w:type="dxa"/>
+            <w:tcW w:w="1489" w:type="dxa"/>
             <w:tcMar>
               <w:top w:w="30" w:type="dxa"/>
               <w:left w:w="45" w:type="dxa"/>
@@ -34625,6 +34901,10 @@
             <w:hideMark/>
           </w:tcPr>
           <w:p>
+            <w:pPr>
+              <w:spacing w:before="0" w:after="0"/>
+              <w:ind w:firstLine="0"/>
+            </w:pPr>
             <w:r>
               <w:t>-1.5197</w:t>
             </w:r>
@@ -34632,7 +34912,7 @@
         </w:tc>
         <w:tc>
           <w:tcPr>
-            <w:tcW w:w="1193" w:type="dxa"/>
+            <w:tcW w:w="1604" w:type="dxa"/>
             <w:gridSpan w:val="2"/>
             <w:tcMar>
               <w:top w:w="30" w:type="dxa"/>
@@ -34644,6 +34924,10 @@
             <w:hideMark/>
           </w:tcPr>
           <w:p>
+            <w:pPr>
+              <w:spacing w:before="0" w:after="0"/>
+              <w:ind w:firstLine="0"/>
+            </w:pPr>
             <w:r>
               <w:t>-0.2395</w:t>
             </w:r>
@@ -34651,7 +34935,7 @@
         </w:tc>
         <w:tc>
           <w:tcPr>
-            <w:tcW w:w="1516" w:type="dxa"/>
+            <w:tcW w:w="1044" w:type="dxa"/>
             <w:tcMar>
               <w:top w:w="30" w:type="dxa"/>
               <w:left w:w="45" w:type="dxa"/>
@@ -34663,6 +34947,8 @@
           </w:tcPr>
           <w:p>
             <w:pPr>
+              <w:spacing w:before="0" w:after="0"/>
+              <w:ind w:firstLine="0"/>
               <w:rPr>
                 <w:b/>
                 <w:bCs/>
@@ -34679,7 +34965,7 @@
         </w:tc>
         <w:tc>
           <w:tcPr>
-            <w:tcW w:w="1620" w:type="dxa"/>
+            <w:tcW w:w="1597" w:type="dxa"/>
             <w:tcMar>
               <w:top w:w="30" w:type="dxa"/>
               <w:left w:w="45" w:type="dxa"/>
@@ -34691,6 +34977,8 @@
           </w:tcPr>
           <w:p>
             <w:pPr>
+              <w:spacing w:before="0" w:after="0"/>
+              <w:ind w:firstLine="0"/>
               <w:rPr>
                 <w:b/>
                 <w:bCs/>
@@ -34712,7 +35000,7 @@
         </w:trPr>
         <w:tc>
           <w:tcPr>
-            <w:tcW w:w="1535" w:type="dxa"/>
+            <w:tcW w:w="2340" w:type="dxa"/>
             <w:tcMar>
               <w:top w:w="30" w:type="dxa"/>
               <w:left w:w="45" w:type="dxa"/>
@@ -34723,6 +35011,10 @@
             <w:hideMark/>
           </w:tcPr>
           <w:p>
+            <w:pPr>
+              <w:spacing w:before="0" w:after="0"/>
+              <w:ind w:firstLine="0"/>
+            </w:pPr>
             <w:r>
               <w:t>Pgl360_TNW</w:t>
             </w:r>
@@ -34730,10 +35022,14 @@
         </w:tc>
         <w:tc>
           <w:tcPr>
-            <w:tcW w:w="1297" w:type="dxa"/>
-            <w:vAlign w:val="center"/>
-          </w:tcPr>
-          <w:p>
+            <w:tcW w:w="1701" w:type="dxa"/>
+            <w:vAlign w:val="center"/>
+          </w:tcPr>
+          <w:p>
+            <w:pPr>
+              <w:spacing w:before="0" w:after="0"/>
+              <w:ind w:firstLine="0"/>
+            </w:pPr>
             <w:r>
               <w:rPr>
                 <w:color w:val="000000"/>
@@ -34744,7 +35040,7 @@
         </w:tc>
         <w:tc>
           <w:tcPr>
-            <w:tcW w:w="1111" w:type="dxa"/>
+            <w:tcW w:w="1489" w:type="dxa"/>
             <w:tcMar>
               <w:top w:w="30" w:type="dxa"/>
               <w:left w:w="45" w:type="dxa"/>
@@ -34755,6 +35051,10 @@
             <w:hideMark/>
           </w:tcPr>
           <w:p>
+            <w:pPr>
+              <w:spacing w:before="0" w:after="0"/>
+              <w:ind w:firstLine="0"/>
+            </w:pPr>
             <w:r>
               <w:t>-0.3443</w:t>
             </w:r>
@@ -34762,7 +35062,7 @@
         </w:tc>
         <w:tc>
           <w:tcPr>
-            <w:tcW w:w="1193" w:type="dxa"/>
+            <w:tcW w:w="1604" w:type="dxa"/>
             <w:gridSpan w:val="2"/>
             <w:tcMar>
               <w:top w:w="30" w:type="dxa"/>
@@ -34774,6 +35074,10 @@
             <w:hideMark/>
           </w:tcPr>
           <w:p>
+            <w:pPr>
+              <w:spacing w:before="0" w:after="0"/>
+              <w:ind w:firstLine="0"/>
+            </w:pPr>
             <w:r>
               <w:t>0.1524</w:t>
             </w:r>
@@ -34781,7 +35085,7 @@
         </w:tc>
         <w:tc>
           <w:tcPr>
-            <w:tcW w:w="1516" w:type="dxa"/>
+            <w:tcW w:w="1044" w:type="dxa"/>
             <w:tcMar>
               <w:top w:w="30" w:type="dxa"/>
               <w:left w:w="45" w:type="dxa"/>
@@ -34793,6 +35097,8 @@
           </w:tcPr>
           <w:p>
             <w:pPr>
+              <w:spacing w:before="0" w:after="0"/>
+              <w:ind w:firstLine="0"/>
               <w:rPr>
                 <w:b/>
                 <w:bCs/>
@@ -34809,7 +35115,7 @@
         </w:tc>
         <w:tc>
           <w:tcPr>
-            <w:tcW w:w="1620" w:type="dxa"/>
+            <w:tcW w:w="1597" w:type="dxa"/>
             <w:tcMar>
               <w:top w:w="30" w:type="dxa"/>
               <w:left w:w="45" w:type="dxa"/>
@@ -34821,6 +35127,8 @@
           </w:tcPr>
           <w:p>
             <w:pPr>
+              <w:spacing w:before="0" w:after="0"/>
+              <w:ind w:firstLine="0"/>
               <w:rPr>
                 <w:b/>
                 <w:bCs/>
@@ -34842,7 +35150,7 @@
         </w:trPr>
         <w:tc>
           <w:tcPr>
-            <w:tcW w:w="1535" w:type="dxa"/>
+            <w:tcW w:w="2340" w:type="dxa"/>
             <w:tcMar>
               <w:top w:w="30" w:type="dxa"/>
               <w:left w:w="45" w:type="dxa"/>
@@ -34854,6 +35162,8 @@
           </w:tcPr>
           <w:p>
             <w:pPr>
+              <w:spacing w:before="0" w:after="0"/>
+              <w:ind w:firstLine="0"/>
               <w:rPr>
                 <w:b/>
                 <w:bCs/>
@@ -34866,11 +35176,13 @@
         </w:tc>
         <w:tc>
           <w:tcPr>
-            <w:tcW w:w="1297" w:type="dxa"/>
-            <w:vAlign w:val="center"/>
-          </w:tcPr>
-          <w:p>
-            <w:pPr>
+            <w:tcW w:w="1701" w:type="dxa"/>
+            <w:vAlign w:val="center"/>
+          </w:tcPr>
+          <w:p>
+            <w:pPr>
+              <w:spacing w:before="0" w:after="0"/>
+              <w:ind w:firstLine="0"/>
               <w:rPr>
                 <w:b/>
                 <w:bCs/>
@@ -34886,7 +35198,7 @@
         </w:tc>
         <w:tc>
           <w:tcPr>
-            <w:tcW w:w="1111" w:type="dxa"/>
+            <w:tcW w:w="1489" w:type="dxa"/>
             <w:tcMar>
               <w:top w:w="30" w:type="dxa"/>
               <w:left w:w="45" w:type="dxa"/>
@@ -34898,6 +35210,8 @@
           </w:tcPr>
           <w:p>
             <w:pPr>
+              <w:spacing w:before="0" w:after="0"/>
+              <w:ind w:firstLine="0"/>
               <w:rPr>
                 <w:b/>
                 <w:bCs/>
@@ -34914,7 +35228,7 @@
         </w:tc>
         <w:tc>
           <w:tcPr>
-            <w:tcW w:w="1193" w:type="dxa"/>
+            <w:tcW w:w="1604" w:type="dxa"/>
             <w:gridSpan w:val="2"/>
             <w:tcMar>
               <w:top w:w="30" w:type="dxa"/>
@@ -34927,6 +35241,8 @@
           </w:tcPr>
           <w:p>
             <w:pPr>
+              <w:spacing w:before="0" w:after="0"/>
+              <w:ind w:firstLine="0"/>
               <w:rPr>
                 <w:b/>
                 <w:bCs/>
@@ -34943,7 +35259,7 @@
         </w:tc>
         <w:tc>
           <w:tcPr>
-            <w:tcW w:w="1516" w:type="dxa"/>
+            <w:tcW w:w="1044" w:type="dxa"/>
             <w:tcMar>
               <w:top w:w="30" w:type="dxa"/>
               <w:left w:w="45" w:type="dxa"/>
@@ -34955,6 +35271,8 @@
           </w:tcPr>
           <w:p>
             <w:pPr>
+              <w:spacing w:before="0" w:after="0"/>
+              <w:ind w:firstLine="0"/>
               <w:rPr>
                 <w:b/>
                 <w:bCs/>
@@ -34971,7 +35289,7 @@
         </w:tc>
         <w:tc>
           <w:tcPr>
-            <w:tcW w:w="1620" w:type="dxa"/>
+            <w:tcW w:w="1597" w:type="dxa"/>
             <w:tcMar>
               <w:top w:w="30" w:type="dxa"/>
               <w:left w:w="45" w:type="dxa"/>
@@ -34983,6 +35301,8 @@
           </w:tcPr>
           <w:p>
             <w:pPr>
+              <w:spacing w:before="0" w:after="0"/>
+              <w:ind w:firstLine="0"/>
               <w:rPr>
                 <w:b/>
                 <w:bCs/>
@@ -35004,7 +35324,7 @@
         </w:trPr>
         <w:tc>
           <w:tcPr>
-            <w:tcW w:w="1535" w:type="dxa"/>
+            <w:tcW w:w="2340" w:type="dxa"/>
             <w:tcMar>
               <w:top w:w="30" w:type="dxa"/>
               <w:left w:w="45" w:type="dxa"/>
@@ -35016,6 +35336,8 @@
           </w:tcPr>
           <w:p>
             <w:pPr>
+              <w:spacing w:before="0" w:after="0"/>
+              <w:ind w:firstLine="0"/>
               <w:rPr>
                 <w:b/>
                 <w:bCs/>
@@ -35028,11 +35350,13 @@
         </w:tc>
         <w:tc>
           <w:tcPr>
-            <w:tcW w:w="1297" w:type="dxa"/>
-            <w:vAlign w:val="center"/>
-          </w:tcPr>
-          <w:p>
-            <w:pPr>
+            <w:tcW w:w="1701" w:type="dxa"/>
+            <w:vAlign w:val="center"/>
+          </w:tcPr>
+          <w:p>
+            <w:pPr>
+              <w:spacing w:before="0" w:after="0"/>
+              <w:ind w:firstLine="0"/>
               <w:rPr>
                 <w:b/>
                 <w:bCs/>
@@ -35048,7 +35372,7 @@
         </w:tc>
         <w:tc>
           <w:tcPr>
-            <w:tcW w:w="1111" w:type="dxa"/>
+            <w:tcW w:w="1489" w:type="dxa"/>
             <w:tcMar>
               <w:top w:w="30" w:type="dxa"/>
               <w:left w:w="45" w:type="dxa"/>
@@ -35060,6 +35384,8 @@
           </w:tcPr>
           <w:p>
             <w:pPr>
+              <w:spacing w:before="0" w:after="0"/>
+              <w:ind w:firstLine="0"/>
               <w:rPr>
                 <w:b/>
                 <w:bCs/>
@@ -35076,7 +35402,7 @@
         </w:tc>
         <w:tc>
           <w:tcPr>
-            <w:tcW w:w="1193" w:type="dxa"/>
+            <w:tcW w:w="1604" w:type="dxa"/>
             <w:gridSpan w:val="2"/>
             <w:tcMar>
               <w:top w:w="30" w:type="dxa"/>
@@ -35089,6 +35415,8 @@
           </w:tcPr>
           <w:p>
             <w:pPr>
+              <w:spacing w:before="0" w:after="0"/>
+              <w:ind w:firstLine="0"/>
               <w:rPr>
                 <w:b/>
                 <w:bCs/>
@@ -35105,7 +35433,7 @@
         </w:tc>
         <w:tc>
           <w:tcPr>
-            <w:tcW w:w="1516" w:type="dxa"/>
+            <w:tcW w:w="1044" w:type="dxa"/>
             <w:tcMar>
               <w:top w:w="30" w:type="dxa"/>
               <w:left w:w="45" w:type="dxa"/>
@@ -35117,6 +35445,8 @@
           </w:tcPr>
           <w:p>
             <w:pPr>
+              <w:spacing w:before="0" w:after="0"/>
+              <w:ind w:firstLine="0"/>
               <w:rPr>
                 <w:b/>
                 <w:bCs/>
@@ -35133,7 +35463,7 @@
         </w:tc>
         <w:tc>
           <w:tcPr>
-            <w:tcW w:w="1620" w:type="dxa"/>
+            <w:tcW w:w="1597" w:type="dxa"/>
             <w:tcMar>
               <w:top w:w="30" w:type="dxa"/>
               <w:left w:w="45" w:type="dxa"/>
@@ -35145,6 +35475,8 @@
           </w:tcPr>
           <w:p>
             <w:pPr>
+              <w:spacing w:before="0" w:after="0"/>
+              <w:ind w:firstLine="0"/>
               <w:rPr>
                 <w:b/>
                 <w:bCs/>
@@ -35166,14 +35498,7 @@
         <w:rPr>
           <w:color w:val="000000"/>
         </w:rPr>
-        <w:t xml:space="preserve">IN, Indiana, Shawnee Hills ecoregion; MO, Missouri, Ozark Plateau ecoregion; KY, Kentucky, Bluegrass ecoregion; TNE, eastern Tennessee, Nashville Basin ecoregion; TNW, </w:t>
-      </w:r>
-      <w:r>
-        <w:rPr>
-          <w:color w:val="000000"/>
-        </w:rPr>
-        <w:lastRenderedPageBreak/>
-        <w:t>western Tennessee, Highland Rim ecoregion; EX-S, ex situ populations;</w:t>
+        <w:t>IN, Indiana, Shawnee Hills ecoregion; MO, Missouri, Ozark Plateau ecoregion; KY, Kentucky, Bluegrass ecoregion; TNE, eastern Tennessee, Nashville Basin ecoregion; TNW, western Tennessee, Highland Rim ecoregion; EX-S, ex situ populations;</w:t>
       </w:r>
       <w:r>
         <w:rPr>
@@ -47162,7 +47487,7 @@
 </file>
 
 <file path=word/endnotes.xml><?xml version="1.0" encoding="utf-8"?>
-<w:endnotes xmlns:wpc="http://schemas.microsoft.com/office/word/2010/wordprocessingCanvas" xmlns:cx="http://schemas.microsoft.com/office/drawing/2014/chartex" xmlns:cx1="http://schemas.microsoft.com/office/drawing/2015/9/8/chartex" xmlns:cx2="http://schemas.microsoft.com/office/drawing/2015/10/21/chartex" xmlns:cx3="http://schemas.microsoft.com/office/drawing/2016/5/9/chartex" xmlns:cx4="http://schemas.microsoft.com/office/drawing/2016/5/10/chartex" xmlns:cx5="http://schemas.microsoft.com/office/drawing/2016/5/11/chartex" xmlns:cx6="http://schemas.microsoft.com/office/drawing/2016/5/12/chartex" xmlns:cx7="http://schemas.microsoft.com/office/drawing/2016/5/13/chartex" xmlns:cx8="http://schemas.microsoft.com/office/drawing/2016/5/14/chartex" xmlns:mc="http://schemas.openxmlformats.org/markup-compatibility/2006" xmlns:aink="http://schemas.microsoft.com/office/drawing/2016/ink" xmlns:am3d="http://schemas.microsoft.com/office/drawing/2017/model3d" xmlns:o="urn:schemas-microsoft-com:office:office" xmlns:oel="http://schemas.microsoft.com/office/2019/extlst" xmlns:r="http://schemas.openxmlformats.org/officeDocument/2006/relationships" xmlns:m="http://schemas.openxmlformats.org/officeDocument/2006/math" xmlns:v="urn:schemas-microsoft-com:vml" xmlns:wp14="http://schemas.microsoft.com/office/word/2010/wordprocessingDrawing" xmlns:wp="http://schemas.openxmlformats.org/drawingml/2006/wordprocessingDrawing" xmlns:w10="urn:schemas-microsoft-com:office:word" xmlns:w="http://schemas.openxmlformats.org/wordprocessingml/2006/main" xmlns:w14="http://schemas.microsoft.com/office/word/2010/wordml" xmlns:w15="http://schemas.microsoft.com/office/word/2012/wordml" xmlns:w16cex="http://schemas.microsoft.com/office/word/2018/wordml/cex" xmlns:w16cid="http://schemas.microsoft.com/office/word/2016/wordml/cid" xmlns:w16="http://schemas.microsoft.com/office/word/2018/wordml" xmlns:w16du="http://schemas.microsoft.com/office/word/2023/wordml/word16du" xmlns:w16sdtdh="http://schemas.microsoft.com/office/word/2020/wordml/sdtdatahash" xmlns:w16sdtfl="http://schemas.microsoft.com/office/word/2024/wordml/sdtformatlock" xmlns:w16se="http://schemas.microsoft.com/office/word/2015/wordml/symex" xmlns:wpg="http://schemas.microsoft.com/office/word/2010/wordprocessingGroup" xmlns:wpi="http://schemas.microsoft.com/office/word/2010/wordprocessingInk" xmlns:wne="http://schemas.microsoft.com/office/word/2006/wordml" xmlns:wps="http://schemas.microsoft.com/office/word/2010/wordprocessingShape" mc:Ignorable="w14 w15 w16se w16cid w16 w16cex w16sdtdh w16sdtfl w16du wp14">
+<w:endnotes xmlns:wpc="http://schemas.microsoft.com/office/word/2010/wordprocessingCanvas" xmlns:cx="http://schemas.microsoft.com/office/drawing/2014/chartex" xmlns:cx1="http://schemas.microsoft.com/office/drawing/2015/9/8/chartex" xmlns:cx2="http://schemas.microsoft.com/office/drawing/2015/10/21/chartex" xmlns:cx3="http://schemas.microsoft.com/office/drawing/2016/5/9/chartex" xmlns:cx4="http://schemas.microsoft.com/office/drawing/2016/5/10/chartex" xmlns:cx5="http://schemas.microsoft.com/office/drawing/2016/5/11/chartex" xmlns:cx6="http://schemas.microsoft.com/office/drawing/2016/5/12/chartex" xmlns:cx7="http://schemas.microsoft.com/office/drawing/2016/5/13/chartex" xmlns:cx8="http://schemas.microsoft.com/office/drawing/2016/5/14/chartex" xmlns:mc="http://schemas.openxmlformats.org/markup-compatibility/2006" xmlns:m="http://schemas.openxmlformats.org/officeDocument/2006/math" xmlns:aink="http://schemas.microsoft.com/office/drawing/2016/ink" xmlns:am3d="http://schemas.microsoft.com/office/drawing/2017/model3d" xmlns:oel="http://schemas.microsoft.com/office/2019/extlst" xmlns:r="http://schemas.openxmlformats.org/officeDocument/2006/relationships" xmlns:wp14="http://schemas.microsoft.com/office/word/2010/wordprocessingDrawing" xmlns:wp="http://schemas.openxmlformats.org/drawingml/2006/wordprocessingDrawing" xmlns:wpg="http://schemas.microsoft.com/office/word/2010/wordprocessingGroup" xmlns:wpi="http://schemas.microsoft.com/office/word/2010/wordprocessingInk" xmlns:wps="http://schemas.microsoft.com/office/word/2010/wordprocessingShape" xmlns:o="urn:schemas-microsoft-com:office:office" xmlns:v="urn:schemas-microsoft-com:vml" xmlns:w10="urn:schemas-microsoft-com:office:word" xmlns:w="http://schemas.openxmlformats.org/wordprocessingml/2006/main" xmlns:w14="http://schemas.microsoft.com/office/word/2010/wordml" xmlns:w15="http://schemas.microsoft.com/office/word/2012/wordml" xmlns:w16cex="http://schemas.microsoft.com/office/word/2018/wordml/cex" xmlns:w16cid="http://schemas.microsoft.com/office/word/2016/wordml/cid" xmlns:w16="http://schemas.microsoft.com/office/word/2018/wordml" xmlns:w16sdtdh="http://schemas.microsoft.com/office/word/2020/wordml/sdtdatahash" xmlns:w16sdtfl="http://schemas.microsoft.com/office/word/2024/wordml/sdtformatlock" xmlns:w16se="http://schemas.microsoft.com/office/word/2015/wordml/symex" xmlns:w16du="http://schemas.microsoft.com/office/word/2023/wordml/word16du" xmlns:wne="http://schemas.microsoft.com/office/word/2006/wordml" mc:Ignorable="w14 w15 w16se w16cid w16 w16cex w16sdtdh w16sdtfl w16du wp14">
   <w:endnote w:type="separator" w:id="-1">
     <w:p>
       <w:r>
@@ -47181,7 +47506,7 @@
 </file>
 
 <file path=word/footnotes.xml><?xml version="1.0" encoding="utf-8"?>
-<w:footnotes xmlns:wpc="http://schemas.microsoft.com/office/word/2010/wordprocessingCanvas" xmlns:cx="http://schemas.microsoft.com/office/drawing/2014/chartex" xmlns:cx1="http://schemas.microsoft.com/office/drawing/2015/9/8/chartex" xmlns:cx2="http://schemas.microsoft.com/office/drawing/2015/10/21/chartex" xmlns:cx3="http://schemas.microsoft.com/office/drawing/2016/5/9/chartex" xmlns:cx4="http://schemas.microsoft.com/office/drawing/2016/5/10/chartex" xmlns:cx5="http://schemas.microsoft.com/office/drawing/2016/5/11/chartex" xmlns:cx6="http://schemas.microsoft.com/office/drawing/2016/5/12/chartex" xmlns:cx7="http://schemas.microsoft.com/office/drawing/2016/5/13/chartex" xmlns:cx8="http://schemas.microsoft.com/office/drawing/2016/5/14/chartex" xmlns:mc="http://schemas.openxmlformats.org/markup-compatibility/2006" xmlns:aink="http://schemas.microsoft.com/office/drawing/2016/ink" xmlns:am3d="http://schemas.microsoft.com/office/drawing/2017/model3d" xmlns:o="urn:schemas-microsoft-com:office:office" xmlns:oel="http://schemas.microsoft.com/office/2019/extlst" xmlns:r="http://schemas.openxmlformats.org/officeDocument/2006/relationships" xmlns:m="http://schemas.openxmlformats.org/officeDocument/2006/math" xmlns:v="urn:schemas-microsoft-com:vml" xmlns:wp14="http://schemas.microsoft.com/office/word/2010/wordprocessingDrawing" xmlns:wp="http://schemas.openxmlformats.org/drawingml/2006/wordprocessingDrawing" xmlns:w10="urn:schemas-microsoft-com:office:word" xmlns:w="http://schemas.openxmlformats.org/wordprocessingml/2006/main" xmlns:w14="http://schemas.microsoft.com/office/word/2010/wordml" xmlns:w15="http://schemas.microsoft.com/office/word/2012/wordml" xmlns:w16cex="http://schemas.microsoft.com/office/word/2018/wordml/cex" xmlns:w16cid="http://schemas.microsoft.com/office/word/2016/wordml/cid" xmlns:w16="http://schemas.microsoft.com/office/word/2018/wordml" xmlns:w16du="http://schemas.microsoft.com/office/word/2023/wordml/word16du" xmlns:w16sdtdh="http://schemas.microsoft.com/office/word/2020/wordml/sdtdatahash" xmlns:w16sdtfl="http://schemas.microsoft.com/office/word/2024/wordml/sdtformatlock" xmlns:w16se="http://schemas.microsoft.com/office/word/2015/wordml/symex" xmlns:wpg="http://schemas.microsoft.com/office/word/2010/wordprocessingGroup" xmlns:wpi="http://schemas.microsoft.com/office/word/2010/wordprocessingInk" xmlns:wne="http://schemas.microsoft.com/office/word/2006/wordml" xmlns:wps="http://schemas.microsoft.com/office/word/2010/wordprocessingShape" mc:Ignorable="w14 w15 w16se w16cid w16 w16cex w16sdtdh w16sdtfl w16du wp14">
+<w:footnotes xmlns:wpc="http://schemas.microsoft.com/office/word/2010/wordprocessingCanvas" xmlns:cx="http://schemas.microsoft.com/office/drawing/2014/chartex" xmlns:cx1="http://schemas.microsoft.com/office/drawing/2015/9/8/chartex" xmlns:cx2="http://schemas.microsoft.com/office/drawing/2015/10/21/chartex" xmlns:cx3="http://schemas.microsoft.com/office/drawing/2016/5/9/chartex" xmlns:cx4="http://schemas.microsoft.com/office/drawing/2016/5/10/chartex" xmlns:cx5="http://schemas.microsoft.com/office/drawing/2016/5/11/chartex" xmlns:cx6="http://schemas.microsoft.com/office/drawing/2016/5/12/chartex" xmlns:cx7="http://schemas.microsoft.com/office/drawing/2016/5/13/chartex" xmlns:cx8="http://schemas.microsoft.com/office/drawing/2016/5/14/chartex" xmlns:mc="http://schemas.openxmlformats.org/markup-compatibility/2006" xmlns:m="http://schemas.openxmlformats.org/officeDocument/2006/math" xmlns:aink="http://schemas.microsoft.com/office/drawing/2016/ink" xmlns:am3d="http://schemas.microsoft.com/office/drawing/2017/model3d" xmlns:oel="http://schemas.microsoft.com/office/2019/extlst" xmlns:r="http://schemas.openxmlformats.org/officeDocument/2006/relationships" xmlns:wp14="http://schemas.microsoft.com/office/word/2010/wordprocessingDrawing" xmlns:wp="http://schemas.openxmlformats.org/drawingml/2006/wordprocessingDrawing" xmlns:wpg="http://schemas.microsoft.com/office/word/2010/wordprocessingGroup" xmlns:wpi="http://schemas.microsoft.com/office/word/2010/wordprocessingInk" xmlns:wps="http://schemas.microsoft.com/office/word/2010/wordprocessingShape" xmlns:o="urn:schemas-microsoft-com:office:office" xmlns:v="urn:schemas-microsoft-com:vml" xmlns:w10="urn:schemas-microsoft-com:office:word" xmlns:w="http://schemas.openxmlformats.org/wordprocessingml/2006/main" xmlns:w14="http://schemas.microsoft.com/office/word/2010/wordml" xmlns:w15="http://schemas.microsoft.com/office/word/2012/wordml" xmlns:w16cex="http://schemas.microsoft.com/office/word/2018/wordml/cex" xmlns:w16cid="http://schemas.microsoft.com/office/word/2016/wordml/cid" xmlns:w16="http://schemas.microsoft.com/office/word/2018/wordml" xmlns:w16sdtdh="http://schemas.microsoft.com/office/word/2020/wordml/sdtdatahash" xmlns:w16sdtfl="http://schemas.microsoft.com/office/word/2024/wordml/sdtformatlock" xmlns:w16se="http://schemas.microsoft.com/office/word/2015/wordml/symex" xmlns:w16du="http://schemas.microsoft.com/office/word/2023/wordml/word16du" xmlns:wne="http://schemas.microsoft.com/office/word/2006/wordml" mc:Ignorable="w14 w15 w16se w16cid w16 w16cex w16sdtdh w16sdtfl w16du wp14">
   <w:footnote w:type="separator" w:id="-1">
     <w:p>
       <w:r>
@@ -47200,7 +47525,7 @@
 </file>
 
 <file path=word/header1.xml><?xml version="1.0" encoding="utf-8"?>
-<w:hdr xmlns:wpc="http://schemas.microsoft.com/office/word/2010/wordprocessingCanvas" xmlns:cx="http://schemas.microsoft.com/office/drawing/2014/chartex" xmlns:cx1="http://schemas.microsoft.com/office/drawing/2015/9/8/chartex" xmlns:cx2="http://schemas.microsoft.com/office/drawing/2015/10/21/chartex" xmlns:cx3="http://schemas.microsoft.com/office/drawing/2016/5/9/chartex" xmlns:cx4="http://schemas.microsoft.com/office/drawing/2016/5/10/chartex" xmlns:cx5="http://schemas.microsoft.com/office/drawing/2016/5/11/chartex" xmlns:cx6="http://schemas.microsoft.com/office/drawing/2016/5/12/chartex" xmlns:cx7="http://schemas.microsoft.com/office/drawing/2016/5/13/chartex" xmlns:cx8="http://schemas.microsoft.com/office/drawing/2016/5/14/chartex" xmlns:mc="http://schemas.openxmlformats.org/markup-compatibility/2006" xmlns:aink="http://schemas.microsoft.com/office/drawing/2016/ink" xmlns:am3d="http://schemas.microsoft.com/office/drawing/2017/model3d" xmlns:o="urn:schemas-microsoft-com:office:office" xmlns:oel="http://schemas.microsoft.com/office/2019/extlst" xmlns:r="http://schemas.openxmlformats.org/officeDocument/2006/relationships" xmlns:m="http://schemas.openxmlformats.org/officeDocument/2006/math" xmlns:v="urn:schemas-microsoft-com:vml" xmlns:wp14="http://schemas.microsoft.com/office/word/2010/wordprocessingDrawing" xmlns:wp="http://schemas.openxmlformats.org/drawingml/2006/wordprocessingDrawing" xmlns:w10="urn:schemas-microsoft-com:office:word" xmlns:w="http://schemas.openxmlformats.org/wordprocessingml/2006/main" xmlns:w14="http://schemas.microsoft.com/office/word/2010/wordml" xmlns:w15="http://schemas.microsoft.com/office/word/2012/wordml" xmlns:w16cex="http://schemas.microsoft.com/office/word/2018/wordml/cex" xmlns:w16cid="http://schemas.microsoft.com/office/word/2016/wordml/cid" xmlns:w16="http://schemas.microsoft.com/office/word/2018/wordml" xmlns:w16du="http://schemas.microsoft.com/office/word/2023/wordml/word16du" xmlns:w16sdtdh="http://schemas.microsoft.com/office/word/2020/wordml/sdtdatahash" xmlns:w16sdtfl="http://schemas.microsoft.com/office/word/2024/wordml/sdtformatlock" xmlns:w16se="http://schemas.microsoft.com/office/word/2015/wordml/symex" xmlns:wpg="http://schemas.microsoft.com/office/word/2010/wordprocessingGroup" xmlns:wpi="http://schemas.microsoft.com/office/word/2010/wordprocessingInk" xmlns:wne="http://schemas.microsoft.com/office/word/2006/wordml" xmlns:wps="http://schemas.microsoft.com/office/word/2010/wordprocessingShape" mc:Ignorable="w14 w15 w16se w16cid w16 w16cex w16sdtdh w16sdtfl w16du wp14">
+<w:hdr xmlns:wpc="http://schemas.microsoft.com/office/word/2010/wordprocessingCanvas" xmlns:cx="http://schemas.microsoft.com/office/drawing/2014/chartex" xmlns:cx1="http://schemas.microsoft.com/office/drawing/2015/9/8/chartex" xmlns:cx2="http://schemas.microsoft.com/office/drawing/2015/10/21/chartex" xmlns:cx3="http://schemas.microsoft.com/office/drawing/2016/5/9/chartex" xmlns:cx4="http://schemas.microsoft.com/office/drawing/2016/5/10/chartex" xmlns:cx5="http://schemas.microsoft.com/office/drawing/2016/5/11/chartex" xmlns:cx6="http://schemas.microsoft.com/office/drawing/2016/5/12/chartex" xmlns:cx7="http://schemas.microsoft.com/office/drawing/2016/5/13/chartex" xmlns:cx8="http://schemas.microsoft.com/office/drawing/2016/5/14/chartex" xmlns:mc="http://schemas.openxmlformats.org/markup-compatibility/2006" xmlns:m="http://schemas.openxmlformats.org/officeDocument/2006/math" xmlns:aink="http://schemas.microsoft.com/office/drawing/2016/ink" xmlns:am3d="http://schemas.microsoft.com/office/drawing/2017/model3d" xmlns:oel="http://schemas.microsoft.com/office/2019/extlst" xmlns:r="http://schemas.openxmlformats.org/officeDocument/2006/relationships" xmlns:wp14="http://schemas.microsoft.com/office/word/2010/wordprocessingDrawing" xmlns:wp="http://schemas.openxmlformats.org/drawingml/2006/wordprocessingDrawing" xmlns:wpg="http://schemas.microsoft.com/office/word/2010/wordprocessingGroup" xmlns:wpi="http://schemas.microsoft.com/office/word/2010/wordprocessingInk" xmlns:wps="http://schemas.microsoft.com/office/word/2010/wordprocessingShape" xmlns:o="urn:schemas-microsoft-com:office:office" xmlns:v="urn:schemas-microsoft-com:vml" xmlns:w10="urn:schemas-microsoft-com:office:word" xmlns:w="http://schemas.openxmlformats.org/wordprocessingml/2006/main" xmlns:w14="http://schemas.microsoft.com/office/word/2010/wordml" xmlns:w15="http://schemas.microsoft.com/office/word/2012/wordml" xmlns:w16cex="http://schemas.microsoft.com/office/word/2018/wordml/cex" xmlns:w16cid="http://schemas.microsoft.com/office/word/2016/wordml/cid" xmlns:w16="http://schemas.microsoft.com/office/word/2018/wordml" xmlns:w16sdtdh="http://schemas.microsoft.com/office/word/2020/wordml/sdtdatahash" xmlns:w16sdtfl="http://schemas.microsoft.com/office/word/2024/wordml/sdtformatlock" xmlns:w16se="http://schemas.microsoft.com/office/word/2015/wordml/symex" xmlns:w16du="http://schemas.microsoft.com/office/word/2023/wordml/word16du" xmlns:wne="http://schemas.microsoft.com/office/word/2006/wordml" mc:Ignorable="w14 w15 w16se w16cid w16 w16cex w16sdtdh w16sdtfl w16du wp14">
   <w:p>
     <w:pPr>
       <w:pStyle w:val="Header"/>
@@ -47238,7 +47563,7 @@
 </file>
 
 <file path=word/header2.xml><?xml version="1.0" encoding="utf-8"?>
-<w:hdr xmlns:wpc="http://schemas.microsoft.com/office/word/2010/wordprocessingCanvas" xmlns:cx="http://schemas.microsoft.com/office/drawing/2014/chartex" xmlns:cx1="http://schemas.microsoft.com/office/drawing/2015/9/8/chartex" xmlns:cx2="http://schemas.microsoft.com/office/drawing/2015/10/21/chartex" xmlns:cx3="http://schemas.microsoft.com/office/drawing/2016/5/9/chartex" xmlns:cx4="http://schemas.microsoft.com/office/drawing/2016/5/10/chartex" xmlns:cx5="http://schemas.microsoft.com/office/drawing/2016/5/11/chartex" xmlns:cx6="http://schemas.microsoft.com/office/drawing/2016/5/12/chartex" xmlns:cx7="http://schemas.microsoft.com/office/drawing/2016/5/13/chartex" xmlns:cx8="http://schemas.microsoft.com/office/drawing/2016/5/14/chartex" xmlns:mc="http://schemas.openxmlformats.org/markup-compatibility/2006" xmlns:aink="http://schemas.microsoft.com/office/drawing/2016/ink" xmlns:am3d="http://schemas.microsoft.com/office/drawing/2017/model3d" xmlns:o="urn:schemas-microsoft-com:office:office" xmlns:oel="http://schemas.microsoft.com/office/2019/extlst" xmlns:r="http://schemas.openxmlformats.org/officeDocument/2006/relationships" xmlns:m="http://schemas.openxmlformats.org/officeDocument/2006/math" xmlns:v="urn:schemas-microsoft-com:vml" xmlns:wp14="http://schemas.microsoft.com/office/word/2010/wordprocessingDrawing" xmlns:wp="http://schemas.openxmlformats.org/drawingml/2006/wordprocessingDrawing" xmlns:w10="urn:schemas-microsoft-com:office:word" xmlns:w="http://schemas.openxmlformats.org/wordprocessingml/2006/main" xmlns:w14="http://schemas.microsoft.com/office/word/2010/wordml" xmlns:w15="http://schemas.microsoft.com/office/word/2012/wordml" xmlns:w16cex="http://schemas.microsoft.com/office/word/2018/wordml/cex" xmlns:w16cid="http://schemas.microsoft.com/office/word/2016/wordml/cid" xmlns:w16="http://schemas.microsoft.com/office/word/2018/wordml" xmlns:w16du="http://schemas.microsoft.com/office/word/2023/wordml/word16du" xmlns:w16sdtdh="http://schemas.microsoft.com/office/word/2020/wordml/sdtdatahash" xmlns:w16sdtfl="http://schemas.microsoft.com/office/word/2024/wordml/sdtformatlock" xmlns:w16se="http://schemas.microsoft.com/office/word/2015/wordml/symex" xmlns:wpg="http://schemas.microsoft.com/office/word/2010/wordprocessingGroup" xmlns:wpi="http://schemas.microsoft.com/office/word/2010/wordprocessingInk" xmlns:wne="http://schemas.microsoft.com/office/word/2006/wordml" xmlns:wps="http://schemas.microsoft.com/office/word/2010/wordprocessingShape" mc:Ignorable="w14 w15 w16se w16cid w16 w16cex w16sdtdh w16sdtfl w16du wp14">
+<w:hdr xmlns:wpc="http://schemas.microsoft.com/office/word/2010/wordprocessingCanvas" xmlns:cx="http://schemas.microsoft.com/office/drawing/2014/chartex" xmlns:cx1="http://schemas.microsoft.com/office/drawing/2015/9/8/chartex" xmlns:cx2="http://schemas.microsoft.com/office/drawing/2015/10/21/chartex" xmlns:cx3="http://schemas.microsoft.com/office/drawing/2016/5/9/chartex" xmlns:cx4="http://schemas.microsoft.com/office/drawing/2016/5/10/chartex" xmlns:cx5="http://schemas.microsoft.com/office/drawing/2016/5/11/chartex" xmlns:cx6="http://schemas.microsoft.com/office/drawing/2016/5/12/chartex" xmlns:cx7="http://schemas.microsoft.com/office/drawing/2016/5/13/chartex" xmlns:cx8="http://schemas.microsoft.com/office/drawing/2016/5/14/chartex" xmlns:mc="http://schemas.openxmlformats.org/markup-compatibility/2006" xmlns:m="http://schemas.openxmlformats.org/officeDocument/2006/math" xmlns:aink="http://schemas.microsoft.com/office/drawing/2016/ink" xmlns:am3d="http://schemas.microsoft.com/office/drawing/2017/model3d" xmlns:oel="http://schemas.microsoft.com/office/2019/extlst" xmlns:r="http://schemas.openxmlformats.org/officeDocument/2006/relationships" xmlns:wp14="http://schemas.microsoft.com/office/word/2010/wordprocessingDrawing" xmlns:wp="http://schemas.openxmlformats.org/drawingml/2006/wordprocessingDrawing" xmlns:wpg="http://schemas.microsoft.com/office/word/2010/wordprocessingGroup" xmlns:wpi="http://schemas.microsoft.com/office/word/2010/wordprocessingInk" xmlns:wps="http://schemas.microsoft.com/office/word/2010/wordprocessingShape" xmlns:o="urn:schemas-microsoft-com:office:office" xmlns:v="urn:schemas-microsoft-com:vml" xmlns:w10="urn:schemas-microsoft-com:office:word" xmlns:w="http://schemas.openxmlformats.org/wordprocessingml/2006/main" xmlns:w14="http://schemas.microsoft.com/office/word/2010/wordml" xmlns:w15="http://schemas.microsoft.com/office/word/2012/wordml" xmlns:w16cex="http://schemas.microsoft.com/office/word/2018/wordml/cex" xmlns:w16cid="http://schemas.microsoft.com/office/word/2016/wordml/cid" xmlns:w16="http://schemas.microsoft.com/office/word/2018/wordml" xmlns:w16sdtdh="http://schemas.microsoft.com/office/word/2020/wordml/sdtdatahash" xmlns:w16sdtfl="http://schemas.microsoft.com/office/word/2024/wordml/sdtformatlock" xmlns:w16se="http://schemas.microsoft.com/office/word/2015/wordml/symex" xmlns:w16du="http://schemas.microsoft.com/office/word/2023/wordml/word16du" xmlns:wne="http://schemas.microsoft.com/office/word/2006/wordml" mc:Ignorable="w14 w15 w16se w16cid w16 w16cex w16sdtdh w16sdtfl w16du wp14">
   <w:p>
     <w:pPr>
       <w:pStyle w:val="Header"/>
@@ -47289,7 +47614,7 @@
 </file>
 
 <file path=word/numbering.xml><?xml version="1.0" encoding="utf-8"?>
-<w:numbering xmlns:wpc="http://schemas.microsoft.com/office/word/2010/wordprocessingCanvas" xmlns:cx="http://schemas.microsoft.com/office/drawing/2014/chartex" xmlns:cx1="http://schemas.microsoft.com/office/drawing/2015/9/8/chartex" xmlns:cx2="http://schemas.microsoft.com/office/drawing/2015/10/21/chartex" xmlns:cx3="http://schemas.microsoft.com/office/drawing/2016/5/9/chartex" xmlns:cx4="http://schemas.microsoft.com/office/drawing/2016/5/10/chartex" xmlns:cx5="http://schemas.microsoft.com/office/drawing/2016/5/11/chartex" xmlns:cx6="http://schemas.microsoft.com/office/drawing/2016/5/12/chartex" xmlns:cx7="http://schemas.microsoft.com/office/drawing/2016/5/13/chartex" xmlns:cx8="http://schemas.microsoft.com/office/drawing/2016/5/14/chartex" xmlns:mc="http://schemas.openxmlformats.org/markup-compatibility/2006" xmlns:aink="http://schemas.microsoft.com/office/drawing/2016/ink" xmlns:am3d="http://schemas.microsoft.com/office/drawing/2017/model3d" xmlns:o="urn:schemas-microsoft-com:office:office" xmlns:oel="http://schemas.microsoft.com/office/2019/extlst" xmlns:r="http://schemas.openxmlformats.org/officeDocument/2006/relationships" xmlns:m="http://schemas.openxmlformats.org/officeDocument/2006/math" xmlns:v="urn:schemas-microsoft-com:vml" xmlns:wp14="http://schemas.microsoft.com/office/word/2010/wordprocessingDrawing" xmlns:wp="http://schemas.openxmlformats.org/drawingml/2006/wordprocessingDrawing" xmlns:w10="urn:schemas-microsoft-com:office:word" xmlns:w="http://schemas.openxmlformats.org/wordprocessingml/2006/main" xmlns:w14="http://schemas.microsoft.com/office/word/2010/wordml" xmlns:w15="http://schemas.microsoft.com/office/word/2012/wordml" xmlns:w16cex="http://schemas.microsoft.com/office/word/2018/wordml/cex" xmlns:w16cid="http://schemas.microsoft.com/office/word/2016/wordml/cid" xmlns:w16="http://schemas.microsoft.com/office/word/2018/wordml" xmlns:w16du="http://schemas.microsoft.com/office/word/2023/wordml/word16du" xmlns:w16sdtdh="http://schemas.microsoft.com/office/word/2020/wordml/sdtdatahash" xmlns:w16sdtfl="http://schemas.microsoft.com/office/word/2024/wordml/sdtformatlock" xmlns:w16se="http://schemas.microsoft.com/office/word/2015/wordml/symex" xmlns:wpg="http://schemas.microsoft.com/office/word/2010/wordprocessingGroup" xmlns:wpi="http://schemas.microsoft.com/office/word/2010/wordprocessingInk" xmlns:wne="http://schemas.microsoft.com/office/word/2006/wordml" xmlns:wps="http://schemas.microsoft.com/office/word/2010/wordprocessingShape" mc:Ignorable="w14 w15 w16se w16cid w16 w16cex w16sdtdh w16sdtfl w16du wp14">
+<w:numbering xmlns:wpc="http://schemas.microsoft.com/office/word/2010/wordprocessingCanvas" xmlns:cx="http://schemas.microsoft.com/office/drawing/2014/chartex" xmlns:cx1="http://schemas.microsoft.com/office/drawing/2015/9/8/chartex" xmlns:cx2="http://schemas.microsoft.com/office/drawing/2015/10/21/chartex" xmlns:cx3="http://schemas.microsoft.com/office/drawing/2016/5/9/chartex" xmlns:cx4="http://schemas.microsoft.com/office/drawing/2016/5/10/chartex" xmlns:cx5="http://schemas.microsoft.com/office/drawing/2016/5/11/chartex" xmlns:cx6="http://schemas.microsoft.com/office/drawing/2016/5/12/chartex" xmlns:cx7="http://schemas.microsoft.com/office/drawing/2016/5/13/chartex" xmlns:cx8="http://schemas.microsoft.com/office/drawing/2016/5/14/chartex" xmlns:mc="http://schemas.openxmlformats.org/markup-compatibility/2006" xmlns:m="http://schemas.openxmlformats.org/officeDocument/2006/math" xmlns:aink="http://schemas.microsoft.com/office/drawing/2016/ink" xmlns:am3d="http://schemas.microsoft.com/office/drawing/2017/model3d" xmlns:oel="http://schemas.microsoft.com/office/2019/extlst" xmlns:r="http://schemas.openxmlformats.org/officeDocument/2006/relationships" xmlns:wp14="http://schemas.microsoft.com/office/word/2010/wordprocessingDrawing" xmlns:wp="http://schemas.openxmlformats.org/drawingml/2006/wordprocessingDrawing" xmlns:wpg="http://schemas.microsoft.com/office/word/2010/wordprocessingGroup" xmlns:wpi="http://schemas.microsoft.com/office/word/2010/wordprocessingInk" xmlns:wps="http://schemas.microsoft.com/office/word/2010/wordprocessingShape" xmlns:o="urn:schemas-microsoft-com:office:office" xmlns:v="urn:schemas-microsoft-com:vml" xmlns:w10="urn:schemas-microsoft-com:office:word" xmlns:w="http://schemas.openxmlformats.org/wordprocessingml/2006/main" xmlns:w14="http://schemas.microsoft.com/office/word/2010/wordml" xmlns:w15="http://schemas.microsoft.com/office/word/2012/wordml" xmlns:w16cex="http://schemas.microsoft.com/office/word/2018/wordml/cex" xmlns:w16cid="http://schemas.microsoft.com/office/word/2016/wordml/cid" xmlns:w16="http://schemas.microsoft.com/office/word/2018/wordml" xmlns:w16sdtdh="http://schemas.microsoft.com/office/word/2020/wordml/sdtdatahash" xmlns:w16sdtfl="http://schemas.microsoft.com/office/word/2024/wordml/sdtformatlock" xmlns:w16se="http://schemas.microsoft.com/office/word/2015/wordml/symex" xmlns:w16du="http://schemas.microsoft.com/office/word/2023/wordml/word16du" xmlns:wne="http://schemas.microsoft.com/office/word/2006/wordml" mc:Ignorable="w14 w15 w16se w16cid w16 w16cex w16sdtdh w16sdtfl w16du wp14">
   <w:abstractNum w:abstractNumId="0" w15:restartNumberingAfterBreak="0">
     <w:nsid w:val="FFFFFF1D"/>
     <w:multiLevelType w:val="multilevel"/>
@@ -48001,7 +48326,7 @@
 </file>
 
 <file path=word/styles.xml><?xml version="1.0" encoding="utf-8"?>
-<w:styles xmlns:mc="http://schemas.openxmlformats.org/markup-compatibility/2006" xmlns:r="http://schemas.openxmlformats.org/officeDocument/2006/relationships" xmlns:w="http://schemas.openxmlformats.org/wordprocessingml/2006/main" xmlns:w14="http://schemas.microsoft.com/office/word/2010/wordml" xmlns:w15="http://schemas.microsoft.com/office/word/2012/wordml" xmlns:w16cex="http://schemas.microsoft.com/office/word/2018/wordml/cex" xmlns:w16cid="http://schemas.microsoft.com/office/word/2016/wordml/cid" xmlns:w16="http://schemas.microsoft.com/office/word/2018/wordml" xmlns:w16du="http://schemas.microsoft.com/office/word/2023/wordml/word16du" xmlns:w16sdtdh="http://schemas.microsoft.com/office/word/2020/wordml/sdtdatahash" xmlns:w16sdtfl="http://schemas.microsoft.com/office/word/2024/wordml/sdtformatlock" xmlns:w16se="http://schemas.microsoft.com/office/word/2015/wordml/symex" mc:Ignorable="w14 w15 w16se w16cid w16 w16cex w16sdtdh w16sdtfl w16du">
+<w:styles xmlns:mc="http://schemas.openxmlformats.org/markup-compatibility/2006" xmlns:r="http://schemas.openxmlformats.org/officeDocument/2006/relationships" xmlns:w="http://schemas.openxmlformats.org/wordprocessingml/2006/main" xmlns:w14="http://schemas.microsoft.com/office/word/2010/wordml" xmlns:w15="http://schemas.microsoft.com/office/word/2012/wordml" xmlns:w16cex="http://schemas.microsoft.com/office/word/2018/wordml/cex" xmlns:w16cid="http://schemas.microsoft.com/office/word/2016/wordml/cid" xmlns:w16="http://schemas.microsoft.com/office/word/2018/wordml" xmlns:w16sdtdh="http://schemas.microsoft.com/office/word/2020/wordml/sdtdatahash" xmlns:w16sdtfl="http://schemas.microsoft.com/office/word/2024/wordml/sdtformatlock" xmlns:w16se="http://schemas.microsoft.com/office/word/2015/wordml/symex" xmlns:w16du="http://schemas.microsoft.com/office/word/2023/wordml/word16du" mc:Ignorable="w14 w15 w16se w16cid w16 w16cex w16sdtdh w16sdtfl w16du">
   <w:docDefaults>
     <w:rPrDefault>
       <w:rPr>
@@ -49187,28 +49512,6 @@
 </file>
 
 <file path=customXml/item1.xml><?xml version="1.0" encoding="utf-8"?>
-<?mso-contentType ?>
-<FormTemplates xmlns="http://schemas.microsoft.com/sharepoint/v3/contenttype/forms">
-  <Display>DocumentLibraryForm</Display>
-  <Edit>DocumentLibraryForm</Edit>
-  <New>DocumentLibraryForm</New>
-</FormTemplates>
-</file>
-
-<file path=customXml/item2.xml><?xml version="1.0" encoding="utf-8"?>
-<p:properties xmlns:p="http://schemas.microsoft.com/office/2006/metadata/properties" xmlns:xsi="http://www.w3.org/2001/XMLSchema-instance" xmlns:pc="http://schemas.microsoft.com/office/infopath/2007/PartnerControls">
-  <documentManagement>
-    <_ip_UnifiedCompliancePolicyUIAction xmlns="http://schemas.microsoft.com/sharepoint/v3" xsi:nil="true"/>
-    <TaxCatchAll xmlns="d1cc8434-691a-4797-83e1-dcc9726b69c0" xsi:nil="true"/>
-    <_ip_UnifiedCompliancePolicyProperties xmlns="http://schemas.microsoft.com/sharepoint/v3" xsi:nil="true"/>
-    <lcf76f155ced4ddcb4097134ff3c332f xmlns="2a80cc35-9f79-4cbf-a8b4-f259617c00c0">
-      <Terms xmlns="http://schemas.microsoft.com/office/infopath/2007/PartnerControls"/>
-    </lcf76f155ced4ddcb4097134ff3c332f>
-  </documentManagement>
-</p:properties>
-</file>
-
-<file path=customXml/item3.xml><?xml version="1.0" encoding="utf-8"?>
 <ct:contentTypeSchema xmlns:ct="http://schemas.microsoft.com/office/2006/metadata/contentType" xmlns:ma="http://schemas.microsoft.com/office/2006/metadata/properties/metaAttributes" ct:_="" ma:_="" ma:contentTypeName="Document" ma:contentTypeID="0x01010040E407455DB15F429C332EFB2CC833B9" ma:contentTypeVersion="16" ma:contentTypeDescription="Create a new document." ma:contentTypeScope="" ma:versionID="e65bdc10a34b5d85422609d792258cee">
   <xsd:schema xmlns:xsd="http://www.w3.org/2001/XMLSchema" xmlns:xs="http://www.w3.org/2001/XMLSchema" xmlns:p="http://schemas.microsoft.com/office/2006/metadata/properties" xmlns:ns1="http://schemas.microsoft.com/sharepoint/v3" xmlns:ns2="2a80cc35-9f79-4cbf-a8b4-f259617c00c0" xmlns:ns3="d1cc8434-691a-4797-83e1-dcc9726b69c0" targetNamespace="http://schemas.microsoft.com/office/2006/metadata/properties" ma:root="true" ma:fieldsID="75b3dfc4fdab91ba3b608edf94d3e15e" ns1:_="" ns2:_="" ns3:_="">
     <xsd:import namespace="http://schemas.microsoft.com/sharepoint/v3"/>
@@ -49454,27 +49757,29 @@
 </ct:contentTypeSchema>
 </file>
 
-<file path=customXml/itemProps1.xml><?xml version="1.0" encoding="utf-8"?>
-<ds:datastoreItem xmlns:ds="http://schemas.openxmlformats.org/officeDocument/2006/customXml" ds:itemID="{7F0DEBC1-84DC-4180-A664-8CDA33D90935}">
-  <ds:schemaRefs>
-    <ds:schemaRef ds:uri="http://schemas.microsoft.com/sharepoint/v3/contenttype/forms"/>
-  </ds:schemaRefs>
-</ds:datastoreItem>
+<file path=customXml/item2.xml><?xml version="1.0" encoding="utf-8"?>
+<?mso-contentType ?>
+<FormTemplates xmlns="http://schemas.microsoft.com/sharepoint/v3/contenttype/forms">
+  <Display>DocumentLibraryForm</Display>
+  <Edit>DocumentLibraryForm</Edit>
+  <New>DocumentLibraryForm</New>
+</FormTemplates>
 </file>
 
-<file path=customXml/itemProps2.xml><?xml version="1.0" encoding="utf-8"?>
-<ds:datastoreItem xmlns:ds="http://schemas.openxmlformats.org/officeDocument/2006/customXml" ds:itemID="{2A7469AB-A023-4380-B5EA-E796FC5AB4F3}">
-  <ds:schemaRefs>
-    <ds:schemaRef ds:uri="http://schemas.microsoft.com/office/2006/metadata/properties"/>
-    <ds:schemaRef ds:uri="http://schemas.microsoft.com/office/infopath/2007/PartnerControls"/>
-    <ds:schemaRef ds:uri="http://schemas.microsoft.com/sharepoint/v3"/>
-    <ds:schemaRef ds:uri="d1cc8434-691a-4797-83e1-dcc9726b69c0"/>
-    <ds:schemaRef ds:uri="2a80cc35-9f79-4cbf-a8b4-f259617c00c0"/>
-  </ds:schemaRefs>
-</ds:datastoreItem>
+<file path=customXml/item3.xml><?xml version="1.0" encoding="utf-8"?>
+<p:properties xmlns:p="http://schemas.microsoft.com/office/2006/metadata/properties" xmlns:xsi="http://www.w3.org/2001/XMLSchema-instance" xmlns:pc="http://schemas.microsoft.com/office/infopath/2007/PartnerControls">
+  <documentManagement>
+    <_ip_UnifiedCompliancePolicyUIAction xmlns="http://schemas.microsoft.com/sharepoint/v3" xsi:nil="true"/>
+    <TaxCatchAll xmlns="d1cc8434-691a-4797-83e1-dcc9726b69c0" xsi:nil="true"/>
+    <_ip_UnifiedCompliancePolicyProperties xmlns="http://schemas.microsoft.com/sharepoint/v3" xsi:nil="true"/>
+    <lcf76f155ced4ddcb4097134ff3c332f xmlns="2a80cc35-9f79-4cbf-a8b4-f259617c00c0">
+      <Terms xmlns="http://schemas.microsoft.com/office/infopath/2007/PartnerControls"/>
+    </lcf76f155ced4ddcb4097134ff3c332f>
+  </documentManagement>
+</p:properties>
 </file>
 
-<file path=customXml/itemProps3.xml><?xml version="1.0" encoding="utf-8"?>
+<file path=customXml/itemProps1.xml><?xml version="1.0" encoding="utf-8"?>
 <ds:datastoreItem xmlns:ds="http://schemas.openxmlformats.org/officeDocument/2006/customXml" ds:itemID="{6988D8F3-0DCE-42C8-B3F9-BD26E416B975}">
   <ds:schemaRefs>
     <ds:schemaRef ds:uri="http://schemas.microsoft.com/office/2006/metadata/contentType"/>
@@ -49492,4 +49797,30 @@
     <ds:schemaRef ds:uri="http://schemas.microsoft.com/internal/obd"/>
   </ds:schemaRefs>
 </ds:datastoreItem>
+</file>
+
+<file path=customXml/itemProps2.xml><?xml version="1.0" encoding="utf-8"?>
+<ds:datastoreItem xmlns:ds="http://schemas.openxmlformats.org/officeDocument/2006/customXml" ds:itemID="{7F0DEBC1-84DC-4180-A664-8CDA33D90935}">
+  <ds:schemaRefs>
+    <ds:schemaRef ds:uri="http://schemas.microsoft.com/sharepoint/v3/contenttype/forms"/>
+  </ds:schemaRefs>
+</ds:datastoreItem>
+</file>
+
+<file path=customXml/itemProps3.xml><?xml version="1.0" encoding="utf-8"?>
+<ds:datastoreItem xmlns:ds="http://schemas.openxmlformats.org/officeDocument/2006/customXml" ds:itemID="{2A7469AB-A023-4380-B5EA-E796FC5AB4F3}">
+  <ds:schemaRefs>
+    <ds:schemaRef ds:uri="http://schemas.microsoft.com/office/2006/metadata/properties"/>
+    <ds:schemaRef ds:uri="http://schemas.microsoft.com/office/infopath/2007/PartnerControls"/>
+    <ds:schemaRef ds:uri="http://schemas.microsoft.com/sharepoint/v3"/>
+    <ds:schemaRef ds:uri="d1cc8434-691a-4797-83e1-dcc9726b69c0"/>
+    <ds:schemaRef ds:uri="2a80cc35-9f79-4cbf-a8b4-f259617c00c0"/>
+  </ds:schemaRefs>
+</ds:datastoreItem>
+</file>
+
+<file path=docMetadata/LabelInfo.xml><?xml version="1.0" encoding="utf-8"?>
+<clbl:labelList xmlns:clbl="http://schemas.microsoft.com/office/2020/mipLabelMetadata">
+  <clbl:label id="{58934224-16a4-41c6-83d8-0f8d54723883}" enabled="0" method="" siteId="{58934224-16a4-41c6-83d8-0f8d54723883}" removed="1"/>
+</clbl:labelList>
 </file>
</xml_diff>